<commit_message>
Update QA test case documentation
- Add bug reports for signup password limit and missing subreplies

- Add session hijacking test evidence PDF

- Update authentication test case workbooks and bug report template

- Remove duplicate completed login workbook
</commit_message>
<xml_diff>
--- a/qa-docs/bug-reports/Bug_Report_Template.docx
+++ b/qa-docs/bug-reports/Bug_Report_Template.docx
@@ -32,22 +32,16 @@
       <w:pPr>
         <w:ind w:left="240"/>
         <w:rPr>
-          <w:rFonts w:eastAsia="맑은 고딕" w:hint="eastAsia"/>
+          <w:rFonts w:eastAsia="맑은 고딕"/>
           <w:lang w:eastAsia="ko-KR"/>
         </w:rPr>
       </w:pPr>
-      <w:r>
-        <w:t>[</w:t>
-      </w:r>
       <w:r>
         <w:rPr>
           <w:rFonts w:eastAsia="맑은 고딕" w:hint="eastAsia"/>
           <w:lang w:eastAsia="ko-KR"/>
         </w:rPr>
-        <w:t>Module</w:t>
-      </w:r>
-      <w:r>
-        <w:t>]</w:t>
+        <w:t>Posts_Replies</w:t>
       </w:r>
       <w:r>
         <w:rPr>
@@ -68,7 +62,21 @@
           <w:rFonts w:eastAsia="맑은 고딕" w:hint="eastAsia"/>
           <w:lang w:eastAsia="ko-KR"/>
         </w:rPr>
-        <w:t xml:space="preserve"> [ID#]</w:t>
+        <w:t xml:space="preserve"> [</w:t>
+      </w:r>
+      <w:r>
+        <w:rPr>
+          <w:rFonts w:eastAsia="맑은 고딕" w:hint="eastAsia"/>
+          <w:lang w:eastAsia="ko-KR"/>
+        </w:rPr>
+        <w:t>1</w:t>
+      </w:r>
+      <w:r>
+        <w:rPr>
+          <w:rFonts w:eastAsia="맑은 고딕" w:hint="eastAsia"/>
+          <w:lang w:eastAsia="ko-KR"/>
+        </w:rPr>
+        <w:t>]</w:t>
       </w:r>
     </w:p>
     <w:p>
@@ -83,9 +91,17 @@
     <w:p>
       <w:pPr>
         <w:ind w:left="240"/>
+        <w:rPr>
+          <w:rFonts w:eastAsia="맑은 고딕" w:hint="eastAsia"/>
+          <w:lang w:eastAsia="ko-KR"/>
+        </w:rPr>
       </w:pPr>
       <w:r>
-        <w:t>[Clear and concise bug title]</w:t>
+        <w:rPr>
+          <w:rFonts w:eastAsia="맑은 고딕" w:hint="eastAsia"/>
+          <w:lang w:eastAsia="ko-KR"/>
+        </w:rPr>
+        <w:t>Sub-Replies not displayed</w:t>
       </w:r>
     </w:p>
     <w:p>
@@ -100,33 +116,98 @@
     <w:p>
       <w:pPr>
         <w:ind w:left="240"/>
+        <w:rPr>
+          <w:rFonts w:eastAsia="맑은 고딕" w:hint="eastAsia"/>
+          <w:lang w:eastAsia="ko-KR"/>
+        </w:rPr>
       </w:pPr>
       <w:r>
         <w:t>Browser:</w:t>
+      </w:r>
+      <w:r>
+        <w:rPr>
+          <w:rFonts w:eastAsia="맑은 고딕" w:hint="eastAsia"/>
+          <w:lang w:eastAsia="ko-KR"/>
+        </w:rPr>
+        <w:t xml:space="preserve"> Chrome </w:t>
+      </w:r>
+      <w:r>
+        <w:rPr>
+          <w:rFonts w:eastAsia="맑은 고딕"/>
+          <w:lang w:eastAsia="ko-KR"/>
+        </w:rPr>
+        <w:t>–</w:t>
+      </w:r>
+      <w:r>
+        <w:rPr>
+          <w:rFonts w:eastAsia="맑은 고딕" w:hint="eastAsia"/>
+          <w:lang w:eastAsia="ko-KR"/>
+        </w:rPr>
+        <w:t xml:space="preserve"> All Browsers</w:t>
       </w:r>
     </w:p>
     <w:p>
       <w:pPr>
         <w:ind w:left="240"/>
+        <w:rPr>
+          <w:rFonts w:eastAsia="맑은 고딕" w:hint="eastAsia"/>
+          <w:lang w:eastAsia="ko-KR"/>
+        </w:rPr>
       </w:pPr>
       <w:r>
         <w:t>OS:</w:t>
+      </w:r>
+      <w:r>
+        <w:rPr>
+          <w:rFonts w:eastAsia="맑은 고딕" w:hint="eastAsia"/>
+          <w:lang w:eastAsia="ko-KR"/>
+        </w:rPr>
+        <w:t xml:space="preserve"> Windows</w:t>
       </w:r>
     </w:p>
     <w:p>
       <w:pPr>
         <w:ind w:left="240"/>
+        <w:rPr>
+          <w:rFonts w:eastAsia="맑은 고딕" w:hint="eastAsia"/>
+          <w:lang w:eastAsia="ko-KR"/>
+        </w:rPr>
       </w:pPr>
       <w:r>
         <w:t>Device:</w:t>
+      </w:r>
+      <w:r>
+        <w:rPr>
+          <w:rFonts w:eastAsia="맑은 고딕" w:hint="eastAsia"/>
+          <w:lang w:eastAsia="ko-KR"/>
+        </w:rPr>
+        <w:t xml:space="preserve"> Desktop</w:t>
+      </w:r>
+      <w:r>
+        <w:rPr>
+          <w:rFonts w:eastAsia="맑은 고딕"/>
+          <w:lang w:eastAsia="ko-KR"/>
+        </w:rPr>
+        <w:tab/>
       </w:r>
     </w:p>
     <w:p>
       <w:pPr>
         <w:ind w:left="240"/>
+        <w:rPr>
+          <w:rFonts w:eastAsia="맑은 고딕" w:hint="eastAsia"/>
+          <w:lang w:eastAsia="ko-KR"/>
+        </w:rPr>
       </w:pPr>
       <w:r>
         <w:t>Build/Version:</w:t>
+      </w:r>
+      <w:r>
+        <w:rPr>
+          <w:rFonts w:eastAsia="맑은 고딕" w:hint="eastAsia"/>
+          <w:lang w:eastAsia="ko-KR"/>
+        </w:rPr>
+        <w:t xml:space="preserve"> 1.0</w:t>
       </w:r>
     </w:p>
     <w:p>
@@ -141,25 +222,58 @@
     <w:p>
       <w:pPr>
         <w:ind w:left="240"/>
+        <w:rPr>
+          <w:rFonts w:eastAsia="맑은 고딕" w:hint="eastAsia"/>
+          <w:lang w:eastAsia="ko-KR"/>
+        </w:rPr>
       </w:pPr>
       <w:r>
         <w:t>1.</w:t>
+      </w:r>
+      <w:r>
+        <w:rPr>
+          <w:rFonts w:eastAsia="맑은 고딕" w:hint="eastAsia"/>
+          <w:lang w:eastAsia="ko-KR"/>
+        </w:rPr>
+        <w:t xml:space="preserve"> Have a registered Verse by Verse Account</w:t>
       </w:r>
     </w:p>
     <w:p>
       <w:pPr>
         <w:ind w:left="240"/>
+        <w:rPr>
+          <w:rFonts w:eastAsia="맑은 고딕" w:hint="eastAsia"/>
+          <w:lang w:eastAsia="ko-KR"/>
+        </w:rPr>
       </w:pPr>
       <w:r>
         <w:t>2.</w:t>
+      </w:r>
+      <w:r>
+        <w:rPr>
+          <w:rFonts w:eastAsia="맑은 고딕" w:hint="eastAsia"/>
+          <w:lang w:eastAsia="ko-KR"/>
+        </w:rPr>
+        <w:t xml:space="preserve"> Have a community created or joined</w:t>
       </w:r>
     </w:p>
     <w:p>
       <w:pPr>
         <w:ind w:left="240"/>
+        <w:rPr>
+          <w:rFonts w:eastAsia="맑은 고딕" w:hint="eastAsia"/>
+          <w:lang w:eastAsia="ko-KR"/>
+        </w:rPr>
       </w:pPr>
       <w:r>
-        <w:t>3.</w:t>
+        <w:t>3</w:t>
+      </w:r>
+      <w:r>
+        <w:rPr>
+          <w:rFonts w:eastAsia="맑은 고딕" w:hint="eastAsia"/>
+          <w:lang w:eastAsia="ko-KR"/>
+        </w:rPr>
+        <w:t xml:space="preserve">. Have a post created </w:t>
       </w:r>
     </w:p>
     <w:p>
@@ -174,28 +288,143 @@
     <w:p>
       <w:pPr>
         <w:ind w:left="240"/>
+        <w:rPr>
+          <w:rFonts w:eastAsia="맑은 고딕" w:hint="eastAsia"/>
+          <w:lang w:eastAsia="ko-KR"/>
+        </w:rPr>
       </w:pPr>
       <w:r>
         <w:t>1.</w:t>
+      </w:r>
+      <w:r>
+        <w:rPr>
+          <w:rFonts w:eastAsia="맑은 고딕" w:hint="eastAsia"/>
+          <w:lang w:eastAsia="ko-KR"/>
+        </w:rPr>
+        <w:t xml:space="preserve"> Sign in to Verse </w:t>
+      </w:r>
+      <w:proofErr w:type="gramStart"/>
+      <w:r>
+        <w:rPr>
+          <w:rFonts w:eastAsia="맑은 고딕" w:hint="eastAsia"/>
+          <w:lang w:eastAsia="ko-KR"/>
+        </w:rPr>
+        <w:t>By</w:t>
+      </w:r>
+      <w:proofErr w:type="gramEnd"/>
+      <w:r>
+        <w:rPr>
+          <w:rFonts w:eastAsia="맑은 고딕" w:hint="eastAsia"/>
+          <w:lang w:eastAsia="ko-KR"/>
+        </w:rPr>
+        <w:t xml:space="preserve"> Verse</w:t>
       </w:r>
     </w:p>
     <w:p>
       <w:pPr>
         <w:ind w:left="240"/>
+        <w:rPr>
+          <w:rFonts w:eastAsia="맑은 고딕" w:hint="eastAsia"/>
+          <w:lang w:eastAsia="ko-KR"/>
+        </w:rPr>
       </w:pPr>
       <w:r>
         <w:t>2.</w:t>
+      </w:r>
+      <w:r>
+        <w:rPr>
+          <w:rFonts w:eastAsia="맑은 고딕" w:hint="eastAsia"/>
+          <w:lang w:eastAsia="ko-KR"/>
+        </w:rPr>
+        <w:t xml:space="preserve"> Navigate to /community</w:t>
       </w:r>
     </w:p>
     <w:p>
       <w:pPr>
         <w:ind w:left="240"/>
+        <w:rPr>
+          <w:rFonts w:eastAsia="맑은 고딕"/>
+          <w:lang w:eastAsia="ko-KR"/>
+        </w:rPr>
       </w:pPr>
       <w:r>
         <w:t>3.</w:t>
       </w:r>
+      <w:r>
+        <w:rPr>
+          <w:rFonts w:eastAsia="맑은 고딕" w:hint="eastAsia"/>
+          <w:lang w:eastAsia="ko-KR"/>
+        </w:rPr>
+        <w:t xml:space="preserve"> Click on a post</w:t>
+      </w:r>
     </w:p>
     <w:p>
+      <w:pPr>
+        <w:ind w:left="240"/>
+        <w:rPr>
+          <w:rFonts w:eastAsia="맑은 고딕"/>
+          <w:lang w:eastAsia="ko-KR"/>
+        </w:rPr>
+      </w:pPr>
+      <w:r>
+        <w:rPr>
+          <w:rFonts w:eastAsia="맑은 고딕" w:hint="eastAsia"/>
+          <w:lang w:eastAsia="ko-KR"/>
+        </w:rPr>
+        <w:t>4. Post a reply</w:t>
+      </w:r>
+    </w:p>
+    <w:p>
+      <w:pPr>
+        <w:ind w:left="240"/>
+        <w:rPr>
+          <w:rFonts w:eastAsia="맑은 고딕" w:hint="eastAsia"/>
+          <w:lang w:eastAsia="ko-KR"/>
+        </w:rPr>
+      </w:pPr>
+      <w:r>
+        <w:rPr>
+          <w:rFonts w:eastAsia="맑은 고딕" w:hint="eastAsia"/>
+          <w:lang w:eastAsia="ko-KR"/>
+        </w:rPr>
+        <w:t xml:space="preserve">5. Click </w:t>
+      </w:r>
+      <w:r>
+        <w:rPr>
+          <w:rFonts w:eastAsia="맑은 고딕"/>
+          <w:lang w:eastAsia="ko-KR"/>
+        </w:rPr>
+        <w:t>“</w:t>
+      </w:r>
+      <w:r>
+        <w:rPr>
+          <w:rFonts w:eastAsia="맑은 고딕" w:hint="eastAsia"/>
+          <w:lang w:eastAsia="ko-KR"/>
+        </w:rPr>
+        <w:t>Reply</w:t>
+      </w:r>
+      <w:r>
+        <w:rPr>
+          <w:rFonts w:eastAsia="맑은 고딕"/>
+          <w:lang w:eastAsia="ko-KR"/>
+        </w:rPr>
+        <w:t>”</w:t>
+      </w:r>
+      <w:r>
+        <w:rPr>
+          <w:rFonts w:eastAsia="맑은 고딕" w:hint="eastAsia"/>
+          <w:lang w:eastAsia="ko-KR"/>
+        </w:rPr>
+        <w:t xml:space="preserve"> button to create a sub-reply</w:t>
+      </w:r>
+    </w:p>
+    <w:p>
+      <w:pPr>
+        <w:rPr>
+          <w:rFonts w:eastAsia="맑은 고딕"/>
+          <w:lang w:eastAsia="ko-KR"/>
+        </w:rPr>
+      </w:pPr>
       <w:r>
         <w:rPr>
           <w:b/>
@@ -206,11 +435,111 @@
     </w:p>
     <w:p>
       <w:pPr>
-        <w:ind w:left="240"/>
+        <w:pStyle w:val="ListParagraph"/>
+        <w:numPr>
+          <w:ilvl w:val="0"/>
+          <w:numId w:val="11"/>
+        </w:numPr>
+        <w:rPr>
+          <w:rFonts w:eastAsia="맑은 고딕"/>
+          <w:lang w:eastAsia="ko-KR"/>
+        </w:rPr>
       </w:pPr>
       <w:r>
-        <w:t>[What should happen]</w:t>
+        <w:rPr>
+          <w:rFonts w:eastAsia="맑은 고딕" w:hint="eastAsia"/>
+          <w:lang w:eastAsia="ko-KR"/>
+        </w:rPr>
+        <w:t xml:space="preserve">There should be a </w:t>
       </w:r>
+      <w:r>
+        <w:rPr>
+          <w:rFonts w:eastAsia="맑은 고딕"/>
+          <w:lang w:eastAsia="ko-KR"/>
+        </w:rPr>
+        <w:t>“</w:t>
+      </w:r>
+      <w:r>
+        <w:rPr>
+          <w:rFonts w:eastAsia="맑은 고딕" w:hint="eastAsia"/>
+          <w:lang w:eastAsia="ko-KR"/>
+        </w:rPr>
+        <w:t>View reply</w:t>
+      </w:r>
+      <w:r>
+        <w:rPr>
+          <w:rFonts w:eastAsia="맑은 고딕"/>
+          <w:lang w:eastAsia="ko-KR"/>
+        </w:rPr>
+        <w:t>”</w:t>
+      </w:r>
+      <w:r>
+        <w:rPr>
+          <w:rFonts w:eastAsia="맑은 고딕" w:hint="eastAsia"/>
+          <w:lang w:eastAsia="ko-KR"/>
+        </w:rPr>
+        <w:t xml:space="preserve"> button to show </w:t>
+      </w:r>
+      <w:proofErr w:type="gramStart"/>
+      <w:r>
+        <w:rPr>
+          <w:rFonts w:eastAsia="맑은 고딕" w:hint="eastAsia"/>
+          <w:lang w:eastAsia="ko-KR"/>
+        </w:rPr>
+        <w:t>all of</w:t>
+      </w:r>
+      <w:proofErr w:type="gramEnd"/>
+      <w:r>
+        <w:rPr>
+          <w:rFonts w:eastAsia="맑은 고딕" w:hint="eastAsia"/>
+          <w:lang w:eastAsia="ko-KR"/>
+        </w:rPr>
+        <w:t xml:space="preserve"> the sub-replies that lives under the reply list</w:t>
+      </w:r>
+    </w:p>
+    <w:p>
+      <w:pPr>
+        <w:pStyle w:val="ListParagraph"/>
+        <w:numPr>
+          <w:ilvl w:val="0"/>
+          <w:numId w:val="11"/>
+        </w:numPr>
+        <w:rPr>
+          <w:rFonts w:eastAsia="맑은 고딕" w:hint="eastAsia"/>
+          <w:lang w:eastAsia="ko-KR"/>
+        </w:rPr>
+      </w:pPr>
+      <w:r>
+        <w:rPr>
+          <w:rFonts w:eastAsia="맑은 고딕" w:hint="eastAsia"/>
+          <w:lang w:eastAsia="ko-KR"/>
+        </w:rPr>
+        <w:t xml:space="preserve">Reply count </w:t>
+      </w:r>
+      <w:r>
+        <w:rPr>
+          <w:rFonts w:eastAsia="맑은 고딕"/>
+          <w:lang w:eastAsia="ko-KR"/>
+        </w:rPr>
+        <w:t>–</w:t>
+      </w:r>
+      <w:r>
+        <w:rPr>
+          <w:rFonts w:eastAsia="맑은 고딕" w:hint="eastAsia"/>
+          <w:lang w:eastAsia="ko-KR"/>
+        </w:rPr>
+        <w:t xml:space="preserve"> the number of replies displayed in the brackets should increment by 1</w:t>
+      </w:r>
+    </w:p>
+    <w:p>
+      <w:pPr>
+        <w:rPr>
+          <w:rFonts w:eastAsia="맑은 고딕"/>
+          <w:b/>
+          <w:sz w:val="24"/>
+          <w:lang w:eastAsia="ko-KR"/>
+        </w:rPr>
+      </w:pPr>
     </w:p>
     <w:p>
       <w:r>
@@ -224,9 +553,33 @@
     <w:p>
       <w:pPr>
         <w:ind w:left="240"/>
+        <w:rPr>
+          <w:rFonts w:eastAsia="맑은 고딕" w:hint="eastAsia"/>
+          <w:lang w:eastAsia="ko-KR"/>
+        </w:rPr>
       </w:pPr>
       <w:r>
-        <w:t>[What actually happens]</w:t>
+        <w:rPr>
+          <w:rFonts w:eastAsia="맑은 고딕" w:hint="eastAsia"/>
+          <w:lang w:eastAsia="ko-KR"/>
+        </w:rPr>
+        <w:t xml:space="preserve">Reply count increments by 1, but </w:t>
+      </w:r>
+      <w:proofErr w:type="gramStart"/>
+      <w:r>
+        <w:rPr>
+          <w:rFonts w:eastAsia="맑은 고딕" w:hint="eastAsia"/>
+          <w:lang w:eastAsia="ko-KR"/>
+        </w:rPr>
+        <w:t>user is</w:t>
+      </w:r>
+      <w:proofErr w:type="gramEnd"/>
+      <w:r>
+        <w:rPr>
+          <w:rFonts w:eastAsia="맑은 고딕" w:hint="eastAsia"/>
+          <w:lang w:eastAsia="ko-KR"/>
+        </w:rPr>
+        <w:t xml:space="preserve"> unable to see the sub-replies</w:t>
       </w:r>
     </w:p>
     <w:p>
@@ -241,9 +594,13 @@
     <w:p>
       <w:pPr>
         <w:ind w:left="240"/>
+        <w:rPr>
+          <w:rFonts w:eastAsia="맑은 고딕" w:hint="eastAsia"/>
+          <w:lang w:eastAsia="ko-KR"/>
+        </w:rPr>
       </w:pPr>
       <w:r>
-        <w:t>Critical / High / Medium / Low</w:t>
+        <w:t>Critical</w:t>
       </w:r>
     </w:p>
     <w:p>
@@ -252,16 +609,19 @@
           <w:b/>
           <w:sz w:val="24"/>
         </w:rPr>
-        <w:lastRenderedPageBreak/>
         <w:t>Priority:</w:t>
       </w:r>
     </w:p>
     <w:p>
       <w:pPr>
         <w:ind w:left="240"/>
+        <w:rPr>
+          <w:rFonts w:eastAsia="맑은 고딕" w:hint="eastAsia"/>
+          <w:lang w:eastAsia="ko-KR"/>
+        </w:rPr>
       </w:pPr>
       <w:r>
-        <w:t>High / Medium / Low</w:t>
+        <w:t>High</w:t>
       </w:r>
     </w:p>
     <w:p>
@@ -276,9 +636,17 @@
     <w:p>
       <w:pPr>
         <w:ind w:left="240"/>
+        <w:rPr>
+          <w:rFonts w:eastAsia="맑은 고딕" w:hint="eastAsia"/>
+          <w:lang w:eastAsia="ko-KR"/>
+        </w:rPr>
       </w:pPr>
       <w:r>
-        <w:t>Open / In Progress / Fixed / Reopened / Closed</w:t>
+        <w:rPr>
+          <w:rFonts w:eastAsia="맑은 고딕" w:hint="eastAsia"/>
+          <w:lang w:eastAsia="ko-KR"/>
+        </w:rPr>
+        <w:t>Closed</w:t>
       </w:r>
     </w:p>
     <w:p>
@@ -291,14 +659,43 @@
       </w:r>
     </w:p>
     <w:p>
-      <w:pPr>
-        <w:ind w:left="240"/>
-      </w:pPr>
       <w:r>
-        <w:t>[Screenshots / Videos]</w:t>
+        <w:drawing>
+          <wp:inline distT="0" distB="0" distL="0" distR="0" wp14:anchorId="260D3DF1" wp14:editId="1A96E6EA">
+            <wp:extent cx="5486400" cy="2036445"/>
+            <wp:effectExtent l="0" t="0" r="0" b="1905"/>
+            <wp:docPr id="1742705567" name="Picture 1"/>
+            <wp:cNvGraphicFramePr>
+              <a:graphicFrameLocks xmlns:a="http://schemas.openxmlformats.org/drawingml/2006/main" noChangeAspect="1"/>
+            </wp:cNvGraphicFramePr>
+            <a:graphic xmlns:a="http://schemas.openxmlformats.org/drawingml/2006/main">
+              <a:graphicData uri="http://schemas.openxmlformats.org/drawingml/2006/picture">
+                <pic:pic xmlns:pic="http://schemas.openxmlformats.org/drawingml/2006/picture">
+                  <pic:nvPicPr>
+                    <pic:cNvPr id="1742705567" name=""/>
+                    <pic:cNvPicPr/>
+                  </pic:nvPicPr>
+                  <pic:blipFill>
+                    <a:blip r:embed="rId6"/>
+                    <a:stretch>
+                      <a:fillRect/>
+                    </a:stretch>
+                  </pic:blipFill>
+                  <pic:spPr>
+                    <a:xfrm>
+                      <a:off x="0" y="0"/>
+                      <a:ext cx="5486400" cy="2036445"/>
+                    </a:xfrm>
+                    <a:prstGeom prst="rect">
+                      <a:avLst/>
+                    </a:prstGeom>
+                  </pic:spPr>
+                </pic:pic>
+              </a:graphicData>
+            </a:graphic>
+          </wp:inline>
+        </w:drawing>
       </w:r>
-    </w:p>
-    <w:p>
       <w:r>
         <w:rPr>
           <w:b/>
@@ -311,9 +708,6 @@
       <w:pPr>
         <w:ind w:left="240"/>
       </w:pPr>
-      <w:r>
-        <w:t>[Additional observations]</w:t>
-      </w:r>
     </w:p>
     <w:sectPr>
       <w:pgSz w:w="12240" w:h="15840"/>
@@ -498,6 +892,232 @@
       </w:rPr>
     </w:lvl>
   </w:abstractNum>
+  <w:abstractNum w:abstractNumId="9" w15:restartNumberingAfterBreak="0">
+    <w:nsid w:val="2CCC4FE3"/>
+    <w:multiLevelType w:val="hybridMultilevel"/>
+    <w:tmpl w:val="74C408D4"/>
+    <w:lvl w:ilvl="0" w:tplc="A9DC0FE8">
+      <w:start w:val="5"/>
+      <w:numFmt w:val="bullet"/>
+      <w:lvlText w:val="-"/>
+      <w:lvlJc w:val="left"/>
+      <w:pPr>
+        <w:ind w:left="720" w:hanging="360"/>
+      </w:pPr>
+      <w:rPr>
+        <w:rFonts w:ascii="Cambria" w:eastAsia="맑은 고딕" w:hAnsi="Cambria" w:cstheme="minorBidi" w:hint="default"/>
+      </w:rPr>
+    </w:lvl>
+    <w:lvl w:ilvl="1" w:tplc="10090003" w:tentative="1">
+      <w:start w:val="1"/>
+      <w:numFmt w:val="bullet"/>
+      <w:lvlText w:val="o"/>
+      <w:lvlJc w:val="left"/>
+      <w:pPr>
+        <w:ind w:left="1440" w:hanging="360"/>
+      </w:pPr>
+      <w:rPr>
+        <w:rFonts w:ascii="Courier New" w:hAnsi="Courier New" w:cs="Courier New" w:hint="default"/>
+      </w:rPr>
+    </w:lvl>
+    <w:lvl w:ilvl="2" w:tplc="10090005" w:tentative="1">
+      <w:start w:val="1"/>
+      <w:numFmt w:val="bullet"/>
+      <w:lvlText w:val=""/>
+      <w:lvlJc w:val="left"/>
+      <w:pPr>
+        <w:ind w:left="2160" w:hanging="360"/>
+      </w:pPr>
+      <w:rPr>
+        <w:rFonts w:ascii="Wingdings" w:hAnsi="Wingdings" w:hint="default"/>
+      </w:rPr>
+    </w:lvl>
+    <w:lvl w:ilvl="3" w:tplc="10090001" w:tentative="1">
+      <w:start w:val="1"/>
+      <w:numFmt w:val="bullet"/>
+      <w:lvlText w:val=""/>
+      <w:lvlJc w:val="left"/>
+      <w:pPr>
+        <w:ind w:left="2880" w:hanging="360"/>
+      </w:pPr>
+      <w:rPr>
+        <w:rFonts w:ascii="Symbol" w:hAnsi="Symbol" w:hint="default"/>
+      </w:rPr>
+    </w:lvl>
+    <w:lvl w:ilvl="4" w:tplc="10090003" w:tentative="1">
+      <w:start w:val="1"/>
+      <w:numFmt w:val="bullet"/>
+      <w:lvlText w:val="o"/>
+      <w:lvlJc w:val="left"/>
+      <w:pPr>
+        <w:ind w:left="3600" w:hanging="360"/>
+      </w:pPr>
+      <w:rPr>
+        <w:rFonts w:ascii="Courier New" w:hAnsi="Courier New" w:cs="Courier New" w:hint="default"/>
+      </w:rPr>
+    </w:lvl>
+    <w:lvl w:ilvl="5" w:tplc="10090005" w:tentative="1">
+      <w:start w:val="1"/>
+      <w:numFmt w:val="bullet"/>
+      <w:lvlText w:val=""/>
+      <w:lvlJc w:val="left"/>
+      <w:pPr>
+        <w:ind w:left="4320" w:hanging="360"/>
+      </w:pPr>
+      <w:rPr>
+        <w:rFonts w:ascii="Wingdings" w:hAnsi="Wingdings" w:hint="default"/>
+      </w:rPr>
+    </w:lvl>
+    <w:lvl w:ilvl="6" w:tplc="10090001" w:tentative="1">
+      <w:start w:val="1"/>
+      <w:numFmt w:val="bullet"/>
+      <w:lvlText w:val=""/>
+      <w:lvlJc w:val="left"/>
+      <w:pPr>
+        <w:ind w:left="5040" w:hanging="360"/>
+      </w:pPr>
+      <w:rPr>
+        <w:rFonts w:ascii="Symbol" w:hAnsi="Symbol" w:hint="default"/>
+      </w:rPr>
+    </w:lvl>
+    <w:lvl w:ilvl="7" w:tplc="10090003" w:tentative="1">
+      <w:start w:val="1"/>
+      <w:numFmt w:val="bullet"/>
+      <w:lvlText w:val="o"/>
+      <w:lvlJc w:val="left"/>
+      <w:pPr>
+        <w:ind w:left="5760" w:hanging="360"/>
+      </w:pPr>
+      <w:rPr>
+        <w:rFonts w:ascii="Courier New" w:hAnsi="Courier New" w:cs="Courier New" w:hint="default"/>
+      </w:rPr>
+    </w:lvl>
+    <w:lvl w:ilvl="8" w:tplc="10090005" w:tentative="1">
+      <w:start w:val="1"/>
+      <w:numFmt w:val="bullet"/>
+      <w:lvlText w:val=""/>
+      <w:lvlJc w:val="left"/>
+      <w:pPr>
+        <w:ind w:left="6480" w:hanging="360"/>
+      </w:pPr>
+      <w:rPr>
+        <w:rFonts w:ascii="Wingdings" w:hAnsi="Wingdings" w:hint="default"/>
+      </w:rPr>
+    </w:lvl>
+  </w:abstractNum>
+  <w:abstractNum w:abstractNumId="10" w15:restartNumberingAfterBreak="0">
+    <w:nsid w:val="32A77D1B"/>
+    <w:multiLevelType w:val="hybridMultilevel"/>
+    <w:tmpl w:val="0C4ADA0C"/>
+    <w:lvl w:ilvl="0" w:tplc="8C5C39F0">
+      <w:start w:val="6"/>
+      <w:numFmt w:val="bullet"/>
+      <w:lvlText w:val="-"/>
+      <w:lvlJc w:val="left"/>
+      <w:pPr>
+        <w:ind w:left="555" w:hanging="360"/>
+      </w:pPr>
+      <w:rPr>
+        <w:rFonts w:ascii="Cambria" w:eastAsia="맑은 고딕" w:hAnsi="Cambria" w:cstheme="minorBidi" w:hint="default"/>
+      </w:rPr>
+    </w:lvl>
+    <w:lvl w:ilvl="1" w:tplc="10090003" w:tentative="1">
+      <w:start w:val="1"/>
+      <w:numFmt w:val="bullet"/>
+      <w:lvlText w:val="o"/>
+      <w:lvlJc w:val="left"/>
+      <w:pPr>
+        <w:ind w:left="1275" w:hanging="360"/>
+      </w:pPr>
+      <w:rPr>
+        <w:rFonts w:ascii="Courier New" w:hAnsi="Courier New" w:cs="Courier New" w:hint="default"/>
+      </w:rPr>
+    </w:lvl>
+    <w:lvl w:ilvl="2" w:tplc="10090005" w:tentative="1">
+      <w:start w:val="1"/>
+      <w:numFmt w:val="bullet"/>
+      <w:lvlText w:val=""/>
+      <w:lvlJc w:val="left"/>
+      <w:pPr>
+        <w:ind w:left="1995" w:hanging="360"/>
+      </w:pPr>
+      <w:rPr>
+        <w:rFonts w:ascii="Wingdings" w:hAnsi="Wingdings" w:hint="default"/>
+      </w:rPr>
+    </w:lvl>
+    <w:lvl w:ilvl="3" w:tplc="10090001" w:tentative="1">
+      <w:start w:val="1"/>
+      <w:numFmt w:val="bullet"/>
+      <w:lvlText w:val=""/>
+      <w:lvlJc w:val="left"/>
+      <w:pPr>
+        <w:ind w:left="2715" w:hanging="360"/>
+      </w:pPr>
+      <w:rPr>
+        <w:rFonts w:ascii="Symbol" w:hAnsi="Symbol" w:hint="default"/>
+      </w:rPr>
+    </w:lvl>
+    <w:lvl w:ilvl="4" w:tplc="10090003" w:tentative="1">
+      <w:start w:val="1"/>
+      <w:numFmt w:val="bullet"/>
+      <w:lvlText w:val="o"/>
+      <w:lvlJc w:val="left"/>
+      <w:pPr>
+        <w:ind w:left="3435" w:hanging="360"/>
+      </w:pPr>
+      <w:rPr>
+        <w:rFonts w:ascii="Courier New" w:hAnsi="Courier New" w:cs="Courier New" w:hint="default"/>
+      </w:rPr>
+    </w:lvl>
+    <w:lvl w:ilvl="5" w:tplc="10090005" w:tentative="1">
+      <w:start w:val="1"/>
+      <w:numFmt w:val="bullet"/>
+      <w:lvlText w:val=""/>
+      <w:lvlJc w:val="left"/>
+      <w:pPr>
+        <w:ind w:left="4155" w:hanging="360"/>
+      </w:pPr>
+      <w:rPr>
+        <w:rFonts w:ascii="Wingdings" w:hAnsi="Wingdings" w:hint="default"/>
+      </w:rPr>
+    </w:lvl>
+    <w:lvl w:ilvl="6" w:tplc="10090001" w:tentative="1">
+      <w:start w:val="1"/>
+      <w:numFmt w:val="bullet"/>
+      <w:lvlText w:val=""/>
+      <w:lvlJc w:val="left"/>
+      <w:pPr>
+        <w:ind w:left="4875" w:hanging="360"/>
+      </w:pPr>
+      <w:rPr>
+        <w:rFonts w:ascii="Symbol" w:hAnsi="Symbol" w:hint="default"/>
+      </w:rPr>
+    </w:lvl>
+    <w:lvl w:ilvl="7" w:tplc="10090003" w:tentative="1">
+      <w:start w:val="1"/>
+      <w:numFmt w:val="bullet"/>
+      <w:lvlText w:val="o"/>
+      <w:lvlJc w:val="left"/>
+      <w:pPr>
+        <w:ind w:left="5595" w:hanging="360"/>
+      </w:pPr>
+      <w:rPr>
+        <w:rFonts w:ascii="Courier New" w:hAnsi="Courier New" w:cs="Courier New" w:hint="default"/>
+      </w:rPr>
+    </w:lvl>
+    <w:lvl w:ilvl="8" w:tplc="10090005" w:tentative="1">
+      <w:start w:val="1"/>
+      <w:numFmt w:val="bullet"/>
+      <w:lvlText w:val=""/>
+      <w:lvlJc w:val="left"/>
+      <w:pPr>
+        <w:ind w:left="6315" w:hanging="360"/>
+      </w:pPr>
+      <w:rPr>
+        <w:rFonts w:ascii="Wingdings" w:hAnsi="Wingdings" w:hint="default"/>
+      </w:rPr>
+    </w:lvl>
+  </w:abstractNum>
   <w:num w:numId="1" w16cid:durableId="1387532221">
     <w:abstractNumId w:val="8"/>
   </w:num>
@@ -524,6 +1144,12 @@
   </w:num>
   <w:num w:numId="9" w16cid:durableId="1885872398">
     <w:abstractNumId w:val="0"/>
+  </w:num>
+  <w:num w:numId="10" w16cid:durableId="2042516123">
+    <w:abstractNumId w:val="10"/>
+  </w:num>
+  <w:num w:numId="11" w16cid:durableId="931620582">
+    <w:abstractNumId w:val="9"/>
   </w:num>
 </w:numbering>
 </file>

</xml_diff>

<commit_message>
Expand QA validation artifacts
- add validation and rule documents for auth, reading, community, and notifications

- update completed test case workbooks across Bible reading, community, and notifications

- revise bug report template and add completed community title/description report
</commit_message>
<xml_diff>
--- a/qa-docs/bug-reports/Bug_Report_Template.docx
+++ b/qa-docs/bug-reports/Bug_Report_Template.docx
@@ -41,7 +41,21 @@
           <w:rFonts w:eastAsia="맑은 고딕" w:hint="eastAsia"/>
           <w:lang w:eastAsia="ko-KR"/>
         </w:rPr>
-        <w:t>Posts_Replies</w:t>
+        <w:t>Community</w:t>
+      </w:r>
+      <w:r>
+        <w:rPr>
+          <w:rFonts w:eastAsia="맑은 고딕" w:hint="eastAsia"/>
+          <w:lang w:eastAsia="ko-KR"/>
+        </w:rPr>
+        <w:t>_</w:t>
+      </w:r>
+      <w:r>
+        <w:rPr>
+          <w:rFonts w:eastAsia="맑은 고딕" w:hint="eastAsia"/>
+          <w:lang w:eastAsia="ko-KR"/>
+        </w:rPr>
+        <w:t>Core</w:t>
       </w:r>
       <w:r>
         <w:rPr>
@@ -101,7 +115,7 @@
           <w:rFonts w:eastAsia="맑은 고딕" w:hint="eastAsia"/>
           <w:lang w:eastAsia="ko-KR"/>
         </w:rPr>
-        <w:t>Sub-Replies not displayed</w:t>
+        <w:t>Community Title edit not implemented</w:t>
       </w:r>
     </w:p>
     <w:p>
@@ -117,7 +131,7 @@
       <w:pPr>
         <w:ind w:left="240"/>
         <w:rPr>
-          <w:rFonts w:eastAsia="맑은 고딕" w:hint="eastAsia"/>
+          <w:rFonts w:eastAsia="맑은 고딕"/>
           <w:lang w:eastAsia="ko-KR"/>
         </w:rPr>
       </w:pPr>
@@ -150,7 +164,7 @@
       <w:pPr>
         <w:ind w:left="240"/>
         <w:rPr>
-          <w:rFonts w:eastAsia="맑은 고딕" w:hint="eastAsia"/>
+          <w:rFonts w:eastAsia="맑은 고딕"/>
           <w:lang w:eastAsia="ko-KR"/>
         </w:rPr>
       </w:pPr>
@@ -169,7 +183,7 @@
       <w:pPr>
         <w:ind w:left="240"/>
         <w:rPr>
-          <w:rFonts w:eastAsia="맑은 고딕" w:hint="eastAsia"/>
+          <w:rFonts w:eastAsia="맑은 고딕"/>
           <w:lang w:eastAsia="ko-KR"/>
         </w:rPr>
       </w:pPr>
@@ -195,7 +209,7 @@
       <w:pPr>
         <w:ind w:left="240"/>
         <w:rPr>
-          <w:rFonts w:eastAsia="맑은 고딕" w:hint="eastAsia"/>
+          <w:rFonts w:eastAsia="맑은 고딕"/>
           <w:lang w:eastAsia="ko-KR"/>
         </w:rPr>
       </w:pPr>
@@ -223,7 +237,7 @@
       <w:pPr>
         <w:ind w:left="240"/>
         <w:rPr>
-          <w:rFonts w:eastAsia="맑은 고딕" w:hint="eastAsia"/>
+          <w:rFonts w:eastAsia="맑은 고딕"/>
           <w:lang w:eastAsia="ko-KR"/>
         </w:rPr>
       </w:pPr>
@@ -254,26 +268,14 @@
           <w:rFonts w:eastAsia="맑은 고딕" w:hint="eastAsia"/>
           <w:lang w:eastAsia="ko-KR"/>
         </w:rPr>
-        <w:t xml:space="preserve"> Have a community created or joined</w:t>
-      </w:r>
-    </w:p>
-    <w:p>
-      <w:pPr>
-        <w:ind w:left="240"/>
-        <w:rPr>
-          <w:rFonts w:eastAsia="맑은 고딕" w:hint="eastAsia"/>
-          <w:lang w:eastAsia="ko-KR"/>
-        </w:rPr>
-      </w:pPr>
-      <w:r>
-        <w:t>3</w:t>
+        <w:t xml:space="preserve"> Have a community created </w:t>
       </w:r>
       <w:r>
         <w:rPr>
           <w:rFonts w:eastAsia="맑은 고딕" w:hint="eastAsia"/>
           <w:lang w:eastAsia="ko-KR"/>
         </w:rPr>
-        <w:t xml:space="preserve">. Have a post created </w:t>
+        <w:t>(Owner permission)</w:t>
       </w:r>
     </w:p>
     <w:p>
@@ -287,248 +289,155 @@
     </w:p>
     <w:p>
       <w:pPr>
-        <w:ind w:left="240"/>
+        <w:numPr>
+          <w:ilvl w:val="0"/>
+          <w:numId w:val="12"/>
+        </w:numPr>
         <w:rPr>
-          <w:rFonts w:eastAsia="맑은 고딕" w:hint="eastAsia"/>
-          <w:lang w:eastAsia="ko-KR"/>
+          <w:lang w:val="en-CA"/>
         </w:rPr>
       </w:pPr>
-      <w:r>
-        <w:t>1.</w:t>
-      </w:r>
       <w:r>
         <w:rPr>
-          <w:rFonts w:eastAsia="맑은 고딕" w:hint="eastAsia"/>
-          <w:lang w:eastAsia="ko-KR"/>
+          <w:lang w:val="en-CA"/>
         </w:rPr>
-        <w:t xml:space="preserve"> Sign in to Verse </w:t>
-      </w:r>
-      <w:proofErr w:type="gramStart"/>
-      <w:r>
-        <w:rPr>
-          <w:rFonts w:eastAsia="맑은 고딕" w:hint="eastAsia"/>
-          <w:lang w:eastAsia="ko-KR"/>
-        </w:rPr>
-        <w:t>By</w:t>
-      </w:r>
-      <w:proofErr w:type="gramEnd"/>
-      <w:r>
-        <w:rPr>
-          <w:rFonts w:eastAsia="맑은 고딕" w:hint="eastAsia"/>
-          <w:lang w:eastAsia="ko-KR"/>
-        </w:rPr>
-        <w:t xml:space="preserve"> Verse</w:t>
+        <w:t>Sign in as the owner of an existing community.</w:t>
       </w:r>
     </w:p>
     <w:p>
       <w:pPr>
-        <w:ind w:left="240"/>
+        <w:numPr>
+          <w:ilvl w:val="0"/>
+          <w:numId w:val="12"/>
+        </w:numPr>
         <w:rPr>
-          <w:rFonts w:eastAsia="맑은 고딕" w:hint="eastAsia"/>
-          <w:lang w:eastAsia="ko-KR"/>
+          <w:lang w:val="en-CA"/>
         </w:rPr>
       </w:pPr>
-      <w:r>
-        <w:t>2.</w:t>
-      </w:r>
       <w:r>
         <w:rPr>
-          <w:rFonts w:eastAsia="맑은 고딕" w:hint="eastAsia"/>
-          <w:lang w:eastAsia="ko-KR"/>
+          <w:lang w:val="en-CA"/>
         </w:rPr>
-        <w:t xml:space="preserve"> Navigate to /community</w:t>
+        <w:t>Go to the community posts page: /community/:id/my-posts.</w:t>
       </w:r>
     </w:p>
     <w:p>
       <w:pPr>
-        <w:ind w:left="240"/>
+        <w:numPr>
+          <w:ilvl w:val="0"/>
+          <w:numId w:val="12"/>
+        </w:numPr>
         <w:rPr>
-          <w:rFonts w:eastAsia="맑은 고딕"/>
-          <w:lang w:eastAsia="ko-KR"/>
+          <w:lang w:val="en-CA"/>
         </w:rPr>
       </w:pPr>
-      <w:r>
-        <w:t>3.</w:t>
-      </w:r>
       <w:r>
         <w:rPr>
-          <w:rFonts w:eastAsia="맑은 고딕" w:hint="eastAsia"/>
-          <w:lang w:eastAsia="ko-KR"/>
+          <w:lang w:val="en-CA"/>
         </w:rPr>
-        <w:t xml:space="preserve"> Click on a post</w:t>
+        <w:t>Confirm the Edit Details button appears near Manage and New Post.</w:t>
       </w:r>
     </w:p>
     <w:p>
       <w:pPr>
-        <w:ind w:left="240"/>
+        <w:numPr>
+          <w:ilvl w:val="0"/>
+          <w:numId w:val="12"/>
+        </w:numPr>
         <w:rPr>
-          <w:rFonts w:eastAsia="맑은 고딕"/>
-          <w:lang w:eastAsia="ko-KR"/>
+          <w:lang w:val="en-CA"/>
         </w:rPr>
       </w:pPr>
       <w:r>
         <w:rPr>
-          <w:rFonts w:eastAsia="맑은 고딕" w:hint="eastAsia"/>
-          <w:lang w:eastAsia="ko-KR"/>
+          <w:lang w:val="en-CA"/>
         </w:rPr>
-        <w:t>4. Post a reply</w:t>
+        <w:t>Click Edit Details.</w:t>
       </w:r>
     </w:p>
     <w:p>
       <w:pPr>
-        <w:ind w:left="240"/>
+        <w:numPr>
+          <w:ilvl w:val="0"/>
+          <w:numId w:val="12"/>
+        </w:numPr>
         <w:rPr>
-          <w:rFonts w:eastAsia="맑은 고딕" w:hint="eastAsia"/>
-          <w:lang w:eastAsia="ko-KR"/>
+          <w:lang w:val="en-CA"/>
         </w:rPr>
       </w:pPr>
       <w:r>
         <w:rPr>
-          <w:rFonts w:eastAsia="맑은 고딕" w:hint="eastAsia"/>
-          <w:lang w:eastAsia="ko-KR"/>
+          <w:lang w:val="en-CA"/>
         </w:rPr>
-        <w:t xml:space="preserve">5. Click </w:t>
-      </w:r>
-      <w:r>
-        <w:rPr>
-          <w:rFonts w:eastAsia="맑은 고딕"/>
-          <w:lang w:eastAsia="ko-KR"/>
-        </w:rPr>
-        <w:t>“</w:t>
-      </w:r>
-      <w:r>
-        <w:rPr>
-          <w:rFonts w:eastAsia="맑은 고딕" w:hint="eastAsia"/>
-          <w:lang w:eastAsia="ko-KR"/>
-        </w:rPr>
-        <w:t>Reply</w:t>
-      </w:r>
-      <w:r>
-        <w:rPr>
-          <w:rFonts w:eastAsia="맑은 고딕"/>
-          <w:lang w:eastAsia="ko-KR"/>
-        </w:rPr>
-        <w:t>”</w:t>
-      </w:r>
-      <w:r>
-        <w:rPr>
-          <w:rFonts w:eastAsia="맑은 고딕" w:hint="eastAsia"/>
-          <w:lang w:eastAsia="ko-KR"/>
-        </w:rPr>
-        <w:t xml:space="preserve"> button to create a sub-reply</w:t>
+        <w:t>Update Community title, Subtitle or purpose, and/or Description.</w:t>
       </w:r>
     </w:p>
     <w:p>
       <w:pPr>
+        <w:numPr>
+          <w:ilvl w:val="0"/>
+          <w:numId w:val="12"/>
+        </w:numPr>
         <w:rPr>
-          <w:rFonts w:eastAsia="맑은 고딕"/>
-          <w:lang w:eastAsia="ko-KR"/>
+          <w:lang w:val="en-CA"/>
         </w:rPr>
       </w:pPr>
       <w:r>
         <w:rPr>
-          <w:b/>
-          <w:sz w:val="24"/>
+          <w:lang w:val="en-CA"/>
         </w:rPr>
-        <w:t>Expected Result:</w:t>
+        <w:t>Click Save details.</w:t>
       </w:r>
     </w:p>
     <w:p>
       <w:pPr>
-        <w:pStyle w:val="ListParagraph"/>
         <w:numPr>
           <w:ilvl w:val="0"/>
-          <w:numId w:val="11"/>
+          <w:numId w:val="12"/>
         </w:numPr>
         <w:rPr>
-          <w:rFonts w:eastAsia="맑은 고딕"/>
-          <w:lang w:eastAsia="ko-KR"/>
+          <w:lang w:val="en-CA"/>
         </w:rPr>
       </w:pPr>
       <w:r>
         <w:rPr>
-          <w:rFonts w:eastAsia="맑은 고딕" w:hint="eastAsia"/>
-          <w:lang w:eastAsia="ko-KR"/>
+          <w:lang w:val="en-CA"/>
         </w:rPr>
-        <w:t xml:space="preserve">There should be a </w:t>
-      </w:r>
-      <w:r>
-        <w:rPr>
-          <w:rFonts w:eastAsia="맑은 고딕"/>
-          <w:lang w:eastAsia="ko-KR"/>
-        </w:rPr>
-        <w:t>“</w:t>
-      </w:r>
-      <w:r>
-        <w:rPr>
-          <w:rFonts w:eastAsia="맑은 고딕" w:hint="eastAsia"/>
-          <w:lang w:eastAsia="ko-KR"/>
-        </w:rPr>
-        <w:t>View reply</w:t>
-      </w:r>
-      <w:r>
-        <w:rPr>
-          <w:rFonts w:eastAsia="맑은 고딕"/>
-          <w:lang w:eastAsia="ko-KR"/>
-        </w:rPr>
-        <w:t>”</w:t>
-      </w:r>
-      <w:r>
-        <w:rPr>
-          <w:rFonts w:eastAsia="맑은 고딕" w:hint="eastAsia"/>
-          <w:lang w:eastAsia="ko-KR"/>
-        </w:rPr>
-        <w:t xml:space="preserve"> button to show </w:t>
-      </w:r>
-      <w:proofErr w:type="gramStart"/>
-      <w:r>
-        <w:rPr>
-          <w:rFonts w:eastAsia="맑은 고딕" w:hint="eastAsia"/>
-          <w:lang w:eastAsia="ko-KR"/>
-        </w:rPr>
-        <w:t>all of</w:t>
-      </w:r>
-      <w:proofErr w:type="gramEnd"/>
-      <w:r>
-        <w:rPr>
-          <w:rFonts w:eastAsia="맑은 고딕" w:hint="eastAsia"/>
-          <w:lang w:eastAsia="ko-KR"/>
-        </w:rPr>
-        <w:t xml:space="preserve"> the sub-replies that lives under the reply list</w:t>
+        <w:t>Confirm the success toast appears.</w:t>
       </w:r>
     </w:p>
     <w:p>
       <w:pPr>
-        <w:pStyle w:val="ListParagraph"/>
         <w:numPr>
           <w:ilvl w:val="0"/>
-          <w:numId w:val="11"/>
+          <w:numId w:val="12"/>
         </w:numPr>
         <w:rPr>
-          <w:rFonts w:eastAsia="맑은 고딕" w:hint="eastAsia"/>
-          <w:lang w:eastAsia="ko-KR"/>
+          <w:lang w:val="en-CA"/>
         </w:rPr>
       </w:pPr>
       <w:r>
         <w:rPr>
-          <w:rFonts w:eastAsia="맑은 고딕" w:hint="eastAsia"/>
-          <w:lang w:eastAsia="ko-KR"/>
+          <w:lang w:val="en-CA"/>
         </w:rPr>
-        <w:t xml:space="preserve">Reply count </w:t>
+        <w:t>Confirm the hero title/subtitle update on the same /my-posts page.</w:t>
       </w:r>
+    </w:p>
+    <w:p>
+      <w:pPr>
+        <w:numPr>
+          <w:ilvl w:val="0"/>
+          <w:numId w:val="12"/>
+        </w:numPr>
+        <w:rPr>
+          <w:lang w:val="en-CA"/>
+        </w:rPr>
+      </w:pPr>
       <w:r>
         <w:rPr>
-          <w:rFonts w:eastAsia="맑은 고딕"/>
-          <w:lang w:eastAsia="ko-KR"/>
+          <w:lang w:val="en-CA"/>
         </w:rPr>
-        <w:t>–</w:t>
-      </w:r>
-      <w:r>
-        <w:rPr>
-          <w:rFonts w:eastAsia="맑은 고딕" w:hint="eastAsia"/>
-          <w:lang w:eastAsia="ko-KR"/>
-        </w:rPr>
-        <w:t xml:space="preserve"> the number of replies displayed in the brackets should increment by 1</w:t>
+        <w:t>Refresh the page and confirm the updated values persist.</w:t>
       </w:r>
     </w:p>
     <w:p>
@@ -540,6 +449,160 @@
           <w:lang w:eastAsia="ko-KR"/>
         </w:rPr>
       </w:pPr>
+    </w:p>
+    <w:p>
+      <w:pPr>
+        <w:rPr>
+          <w:rFonts w:eastAsia="맑은 고딕"/>
+          <w:lang w:eastAsia="ko-KR"/>
+        </w:rPr>
+      </w:pPr>
+      <w:r>
+        <w:rPr>
+          <w:b/>
+          <w:sz w:val="24"/>
+        </w:rPr>
+        <w:lastRenderedPageBreak/>
+        <w:t>Expected Result:</w:t>
+      </w:r>
+    </w:p>
+    <w:p>
+      <w:pPr>
+        <w:numPr>
+          <w:ilvl w:val="0"/>
+          <w:numId w:val="13"/>
+        </w:numPr>
+        <w:rPr>
+          <w:rFonts w:eastAsia="맑은 고딕"/>
+          <w:bCs/>
+          <w:sz w:val="24"/>
+          <w:lang w:val="en-CA" w:eastAsia="ko-KR"/>
+        </w:rPr>
+      </w:pPr>
+      <w:r>
+        <w:rPr>
+          <w:rFonts w:eastAsia="맑은 고딕"/>
+          <w:bCs/>
+          <w:sz w:val="24"/>
+          <w:lang w:val="en-CA" w:eastAsia="ko-KR"/>
+        </w:rPr>
+        <w:t>Only the community owner can see Edit Details on /community/:id/my-posts.</w:t>
+      </w:r>
+    </w:p>
+    <w:p>
+      <w:pPr>
+        <w:numPr>
+          <w:ilvl w:val="0"/>
+          <w:numId w:val="13"/>
+        </w:numPr>
+        <w:rPr>
+          <w:rFonts w:eastAsia="맑은 고딕"/>
+          <w:bCs/>
+          <w:sz w:val="24"/>
+          <w:lang w:val="en-CA" w:eastAsia="ko-KR"/>
+        </w:rPr>
+      </w:pPr>
+      <w:r>
+        <w:rPr>
+          <w:rFonts w:eastAsia="맑은 고딕"/>
+          <w:bCs/>
+          <w:sz w:val="24"/>
+          <w:lang w:val="en-CA" w:eastAsia="ko-KR"/>
+        </w:rPr>
+        <w:t>Clicking Edit Details opens an inline edit panel with the current title, subtitle, and description prefilled.</w:t>
+      </w:r>
+    </w:p>
+    <w:p>
+      <w:pPr>
+        <w:numPr>
+          <w:ilvl w:val="0"/>
+          <w:numId w:val="13"/>
+        </w:numPr>
+        <w:rPr>
+          <w:rFonts w:eastAsia="맑은 고딕"/>
+          <w:bCs/>
+          <w:sz w:val="24"/>
+          <w:lang w:val="en-CA" w:eastAsia="ko-KR"/>
+        </w:rPr>
+      </w:pPr>
+      <w:r>
+        <w:rPr>
+          <w:rFonts w:eastAsia="맑은 고딕"/>
+          <w:bCs/>
+          <w:sz w:val="24"/>
+          <w:lang w:val="en-CA" w:eastAsia="ko-KR"/>
+        </w:rPr>
+        <w:t>Saving sends PATCH /community/:id with header, subheader, and content.</w:t>
+      </w:r>
+    </w:p>
+    <w:p>
+      <w:pPr>
+        <w:numPr>
+          <w:ilvl w:val="0"/>
+          <w:numId w:val="13"/>
+        </w:numPr>
+        <w:rPr>
+          <w:rFonts w:eastAsia="맑은 고딕"/>
+          <w:bCs/>
+          <w:sz w:val="24"/>
+          <w:lang w:val="en-CA" w:eastAsia="ko-KR"/>
+        </w:rPr>
+      </w:pPr>
+      <w:r>
+        <w:rPr>
+          <w:rFonts w:eastAsia="맑은 고딕"/>
+          <w:bCs/>
+          <w:sz w:val="24"/>
+          <w:lang w:val="en-CA" w:eastAsia="ko-KR"/>
+        </w:rPr>
+        <w:t>If the save succeeds, the panel closes, a success toast appears, and the /my-posts hero title/subtitle update immediately.</w:t>
+      </w:r>
+    </w:p>
+    <w:p>
+      <w:pPr>
+        <w:numPr>
+          <w:ilvl w:val="0"/>
+          <w:numId w:val="13"/>
+        </w:numPr>
+        <w:rPr>
+          <w:rFonts w:eastAsia="맑은 고딕"/>
+          <w:bCs/>
+          <w:sz w:val="24"/>
+          <w:lang w:val="en-CA" w:eastAsia="ko-KR"/>
+        </w:rPr>
+      </w:pPr>
+      <w:r>
+        <w:rPr>
+          <w:rFonts w:eastAsia="맑은 고딕"/>
+          <w:bCs/>
+          <w:sz w:val="24"/>
+          <w:lang w:val="en-CA" w:eastAsia="ko-KR"/>
+        </w:rPr>
+        <w:t>The updated description should persist after refresh and appear wherever the community description is displayed.</w:t>
+      </w:r>
+    </w:p>
+    <w:p>
+      <w:pPr>
+        <w:numPr>
+          <w:ilvl w:val="0"/>
+          <w:numId w:val="13"/>
+        </w:numPr>
+        <w:rPr>
+          <w:rFonts w:eastAsia="맑은 고딕"/>
+          <w:bCs/>
+          <w:sz w:val="24"/>
+          <w:lang w:val="en-CA" w:eastAsia="ko-KR"/>
+        </w:rPr>
+      </w:pPr>
+      <w:r>
+        <w:rPr>
+          <w:rFonts w:eastAsia="맑은 고딕"/>
+          <w:bCs/>
+          <w:sz w:val="24"/>
+          <w:lang w:val="en-CA" w:eastAsia="ko-KR"/>
+        </w:rPr>
+        <w:t>If validation fails or the API returns an error, the panel stays open and shows an error without losing the entered text.</w:t>
+      </w:r>
     </w:p>
     <w:p>
       <w:r>
@@ -548,38 +611,6 @@
           <w:sz w:val="24"/>
         </w:rPr>
         <w:t>Actual Result:</w:t>
-      </w:r>
-    </w:p>
-    <w:p>
-      <w:pPr>
-        <w:ind w:left="240"/>
-        <w:rPr>
-          <w:rFonts w:eastAsia="맑은 고딕" w:hint="eastAsia"/>
-          <w:lang w:eastAsia="ko-KR"/>
-        </w:rPr>
-      </w:pPr>
-      <w:r>
-        <w:rPr>
-          <w:rFonts w:eastAsia="맑은 고딕" w:hint="eastAsia"/>
-          <w:lang w:eastAsia="ko-KR"/>
-        </w:rPr>
-        <w:t xml:space="preserve">Reply count increments by 1, but </w:t>
-      </w:r>
-      <w:proofErr w:type="gramStart"/>
-      <w:r>
-        <w:rPr>
-          <w:rFonts w:eastAsia="맑은 고딕" w:hint="eastAsia"/>
-          <w:lang w:eastAsia="ko-KR"/>
-        </w:rPr>
-        <w:t>user is</w:t>
-      </w:r>
-      <w:proofErr w:type="gramEnd"/>
-      <w:r>
-        <w:rPr>
-          <w:rFonts w:eastAsia="맑은 고딕" w:hint="eastAsia"/>
-          <w:lang w:eastAsia="ko-KR"/>
-        </w:rPr>
-        <w:t xml:space="preserve"> unable to see the sub-replies</w:t>
       </w:r>
     </w:p>
     <w:p>
@@ -600,7 +631,11 @@
         </w:rPr>
       </w:pPr>
       <w:r>
-        <w:t>Critical</w:t>
+        <w:rPr>
+          <w:rFonts w:eastAsia="맑은 고딕" w:hint="eastAsia"/>
+          <w:lang w:eastAsia="ko-KR"/>
+        </w:rPr>
+        <w:t>Medium</w:t>
       </w:r>
     </w:p>
     <w:p>
@@ -616,7 +651,7 @@
       <w:pPr>
         <w:ind w:left="240"/>
         <w:rPr>
-          <w:rFonts w:eastAsia="맑은 고딕" w:hint="eastAsia"/>
+          <w:rFonts w:eastAsia="맑은 고딕"/>
           <w:lang w:eastAsia="ko-KR"/>
         </w:rPr>
       </w:pPr>
@@ -637,7 +672,7 @@
       <w:pPr>
         <w:ind w:left="240"/>
         <w:rPr>
-          <w:rFonts w:eastAsia="맑은 고딕" w:hint="eastAsia"/>
+          <w:rFonts w:eastAsia="맑은 고딕"/>
           <w:lang w:eastAsia="ko-KR"/>
         </w:rPr>
       </w:pPr>
@@ -650,6 +685,14 @@
       </w:r>
     </w:p>
     <w:p>
+      <w:pPr>
+        <w:rPr>
+          <w:rFonts w:eastAsia="맑은 고딕"/>
+          <w:b/>
+          <w:sz w:val="24"/>
+          <w:lang w:eastAsia="ko-KR"/>
+        </w:rPr>
+      </w:pPr>
       <w:r>
         <w:rPr>
           <w:b/>
@@ -659,12 +702,23 @@
       </w:r>
     </w:p>
     <w:p>
+      <w:pPr>
+        <w:rPr>
+          <w:rFonts w:eastAsia="맑은 고딕" w:hint="eastAsia"/>
+          <w:lang w:eastAsia="ko-KR"/>
+        </w:rPr>
+      </w:pPr>
       <w:r>
+        <w:rPr>
+          <w:rFonts w:eastAsia="맑은 고딕"/>
+          <w:lang w:eastAsia="ko-KR"/>
+        </w:rPr>
+        <w:lastRenderedPageBreak/>
         <w:drawing>
-          <wp:inline distT="0" distB="0" distL="0" distR="0" wp14:anchorId="260D3DF1" wp14:editId="1A96E6EA">
-            <wp:extent cx="5486400" cy="2036445"/>
-            <wp:effectExtent l="0" t="0" r="0" b="1905"/>
-            <wp:docPr id="1742705567" name="Picture 1"/>
+          <wp:inline distT="0" distB="0" distL="0" distR="0" wp14:anchorId="7D7DF2EB" wp14:editId="0C6ABFDE">
+            <wp:extent cx="4562475" cy="3343175"/>
+            <wp:effectExtent l="0" t="0" r="0" b="0"/>
+            <wp:docPr id="1383624141" name="Picture 1"/>
             <wp:cNvGraphicFramePr>
               <a:graphicFrameLocks xmlns:a="http://schemas.openxmlformats.org/drawingml/2006/main" noChangeAspect="1"/>
             </wp:cNvGraphicFramePr>
@@ -672,11 +726,11 @@
               <a:graphicData uri="http://schemas.openxmlformats.org/drawingml/2006/picture">
                 <pic:pic xmlns:pic="http://schemas.openxmlformats.org/drawingml/2006/picture">
                   <pic:nvPicPr>
-                    <pic:cNvPr id="1742705567" name=""/>
+                    <pic:cNvPr id="1383624141" name=""/>
                     <pic:cNvPicPr/>
                   </pic:nvPicPr>
                   <pic:blipFill>
-                    <a:blip r:embed="rId6"/>
+                    <a:blip r:embed="rId8"/>
                     <a:stretch>
                       <a:fillRect/>
                     </a:stretch>
@@ -684,7 +738,7 @@
                   <pic:spPr>
                     <a:xfrm>
                       <a:off x="0" y="0"/>
-                      <a:ext cx="5486400" cy="2036445"/>
+                      <a:ext cx="4597142" cy="3368577"/>
                     </a:xfrm>
                     <a:prstGeom prst="rect">
                       <a:avLst/>
@@ -696,6 +750,8 @@
           </wp:inline>
         </w:drawing>
       </w:r>
+    </w:p>
+    <w:p>
       <w:r>
         <w:rPr>
           <w:b/>
@@ -717,6 +773,56 @@
     </w:sectPr>
   </w:body>
 </w:document>
+</file>
+
+<file path=word/endnotes.xml><?xml version="1.0" encoding="utf-8"?>
+<w:endnotes xmlns:wpc="http://schemas.microsoft.com/office/word/2010/wordprocessingCanvas" xmlns:cx="http://schemas.microsoft.com/office/drawing/2014/chartex" xmlns:cx1="http://schemas.microsoft.com/office/drawing/2015/9/8/chartex" xmlns:cx2="http://schemas.microsoft.com/office/drawing/2015/10/21/chartex" xmlns:cx3="http://schemas.microsoft.com/office/drawing/2016/5/9/chartex" xmlns:cx4="http://schemas.microsoft.com/office/drawing/2016/5/10/chartex" xmlns:cx5="http://schemas.microsoft.com/office/drawing/2016/5/11/chartex" xmlns:cx6="http://schemas.microsoft.com/office/drawing/2016/5/12/chartex" xmlns:cx7="http://schemas.microsoft.com/office/drawing/2016/5/13/chartex" xmlns:cx8="http://schemas.microsoft.com/office/drawing/2016/5/14/chartex" xmlns:mc="http://schemas.openxmlformats.org/markup-compatibility/2006" xmlns:aink="http://schemas.microsoft.com/office/drawing/2016/ink" xmlns:am3d="http://schemas.microsoft.com/office/drawing/2017/model3d" xmlns:o="urn:schemas-microsoft-com:office:office" xmlns:oel="http://schemas.microsoft.com/office/2019/extlst" xmlns:r="http://schemas.openxmlformats.org/officeDocument/2006/relationships" xmlns:m="http://schemas.openxmlformats.org/officeDocument/2006/math" xmlns:v="urn:schemas-microsoft-com:vml" xmlns:wp14="http://schemas.microsoft.com/office/word/2010/wordprocessingDrawing" xmlns:wp="http://schemas.openxmlformats.org/drawingml/2006/wordprocessingDrawing" xmlns:w10="urn:schemas-microsoft-com:office:word" xmlns:w="http://schemas.openxmlformats.org/wordprocessingml/2006/main" xmlns:w14="http://schemas.microsoft.com/office/word/2010/wordml" xmlns:w15="http://schemas.microsoft.com/office/word/2012/wordml" xmlns:w16cex="http://schemas.microsoft.com/office/word/2018/wordml/cex" xmlns:w16cid="http://schemas.microsoft.com/office/word/2016/wordml/cid" xmlns:w16="http://schemas.microsoft.com/office/word/2018/wordml" xmlns:w16du="http://schemas.microsoft.com/office/word/2023/wordml/word16du" xmlns:w16sdtdh="http://schemas.microsoft.com/office/word/2020/wordml/sdtdatahash" xmlns:w16sdtfl="http://schemas.microsoft.com/office/word/2024/wordml/sdtformatlock" xmlns:w16se="http://schemas.microsoft.com/office/word/2015/wordml/symex" xmlns:wpg="http://schemas.microsoft.com/office/word/2010/wordprocessingGroup" xmlns:wpi="http://schemas.microsoft.com/office/word/2010/wordprocessingInk" xmlns:wne="http://schemas.microsoft.com/office/word/2006/wordml" xmlns:wps="http://schemas.microsoft.com/office/word/2010/wordprocessingShape" mc:Ignorable="w14 w15 w16se w16cid w16 w16cex w16sdtdh w16sdtfl w16du wp14">
+  <w:endnote w:type="separator" w:id="-1">
+    <w:p>
+      <w:pPr>
+        <w:spacing w:after="0" w:line="240" w:lineRule="auto"/>
+      </w:pPr>
+      <w:r>
+        <w:separator/>
+      </w:r>
+    </w:p>
+  </w:endnote>
+  <w:endnote w:type="continuationSeparator" w:id="0">
+    <w:p>
+      <w:pPr>
+        <w:spacing w:after="0" w:line="240" w:lineRule="auto"/>
+      </w:pPr>
+      <w:r>
+        <w:continuationSeparator/>
+      </w:r>
+    </w:p>
+  </w:endnote>
+</w:endnotes>
+</file>
+
+<file path=word/footnotes.xml><?xml version="1.0" encoding="utf-8"?>
+<w:footnotes xmlns:wpc="http://schemas.microsoft.com/office/word/2010/wordprocessingCanvas" xmlns:cx="http://schemas.microsoft.com/office/drawing/2014/chartex" xmlns:cx1="http://schemas.microsoft.com/office/drawing/2015/9/8/chartex" xmlns:cx2="http://schemas.microsoft.com/office/drawing/2015/10/21/chartex" xmlns:cx3="http://schemas.microsoft.com/office/drawing/2016/5/9/chartex" xmlns:cx4="http://schemas.microsoft.com/office/drawing/2016/5/10/chartex" xmlns:cx5="http://schemas.microsoft.com/office/drawing/2016/5/11/chartex" xmlns:cx6="http://schemas.microsoft.com/office/drawing/2016/5/12/chartex" xmlns:cx7="http://schemas.microsoft.com/office/drawing/2016/5/13/chartex" xmlns:cx8="http://schemas.microsoft.com/office/drawing/2016/5/14/chartex" xmlns:mc="http://schemas.openxmlformats.org/markup-compatibility/2006" xmlns:aink="http://schemas.microsoft.com/office/drawing/2016/ink" xmlns:am3d="http://schemas.microsoft.com/office/drawing/2017/model3d" xmlns:o="urn:schemas-microsoft-com:office:office" xmlns:oel="http://schemas.microsoft.com/office/2019/extlst" xmlns:r="http://schemas.openxmlformats.org/officeDocument/2006/relationships" xmlns:m="http://schemas.openxmlformats.org/officeDocument/2006/math" xmlns:v="urn:schemas-microsoft-com:vml" xmlns:wp14="http://schemas.microsoft.com/office/word/2010/wordprocessingDrawing" xmlns:wp="http://schemas.openxmlformats.org/drawingml/2006/wordprocessingDrawing" xmlns:w10="urn:schemas-microsoft-com:office:word" xmlns:w="http://schemas.openxmlformats.org/wordprocessingml/2006/main" xmlns:w14="http://schemas.microsoft.com/office/word/2010/wordml" xmlns:w15="http://schemas.microsoft.com/office/word/2012/wordml" xmlns:w16cex="http://schemas.microsoft.com/office/word/2018/wordml/cex" xmlns:w16cid="http://schemas.microsoft.com/office/word/2016/wordml/cid" xmlns:w16="http://schemas.microsoft.com/office/word/2018/wordml" xmlns:w16du="http://schemas.microsoft.com/office/word/2023/wordml/word16du" xmlns:w16sdtdh="http://schemas.microsoft.com/office/word/2020/wordml/sdtdatahash" xmlns:w16sdtfl="http://schemas.microsoft.com/office/word/2024/wordml/sdtformatlock" xmlns:w16se="http://schemas.microsoft.com/office/word/2015/wordml/symex" xmlns:wpg="http://schemas.microsoft.com/office/word/2010/wordprocessingGroup" xmlns:wpi="http://schemas.microsoft.com/office/word/2010/wordprocessingInk" xmlns:wne="http://schemas.microsoft.com/office/word/2006/wordml" xmlns:wps="http://schemas.microsoft.com/office/word/2010/wordprocessingShape" mc:Ignorable="w14 w15 w16se w16cid w16 w16cex w16sdtdh w16sdtfl w16du wp14">
+  <w:footnote w:type="separator" w:id="-1">
+    <w:p>
+      <w:pPr>
+        <w:spacing w:after="0" w:line="240" w:lineRule="auto"/>
+      </w:pPr>
+      <w:r>
+        <w:separator/>
+      </w:r>
+    </w:p>
+  </w:footnote>
+  <w:footnote w:type="continuationSeparator" w:id="0">
+    <w:p>
+      <w:pPr>
+        <w:spacing w:after="0" w:line="240" w:lineRule="auto"/>
+      </w:pPr>
+      <w:r>
+        <w:continuationSeparator/>
+      </w:r>
+    </w:p>
+  </w:footnote>
+</w:footnotes>
 </file>
 
 <file path=word/numbering.xml><?xml version="1.0" encoding="utf-8"?>
@@ -893,6 +999,155 @@
     </w:lvl>
   </w:abstractNum>
   <w:abstractNum w:abstractNumId="9" w15:restartNumberingAfterBreak="0">
+    <w:nsid w:val="073245EC"/>
+    <w:multiLevelType w:val="multilevel"/>
+    <w:tmpl w:val="710EBDB4"/>
+    <w:lvl w:ilvl="0">
+      <w:start w:val="1"/>
+      <w:numFmt w:val="bullet"/>
+      <w:lvlText w:val=""/>
+      <w:lvlJc w:val="left"/>
+      <w:pPr>
+        <w:tabs>
+          <w:tab w:val="num" w:pos="720"/>
+        </w:tabs>
+        <w:ind w:left="720" w:hanging="360"/>
+      </w:pPr>
+      <w:rPr>
+        <w:rFonts w:ascii="Symbol" w:hAnsi="Symbol" w:hint="default"/>
+        <w:sz w:val="20"/>
+      </w:rPr>
+    </w:lvl>
+    <w:lvl w:ilvl="1" w:tentative="1">
+      <w:start w:val="1"/>
+      <w:numFmt w:val="bullet"/>
+      <w:lvlText w:val=""/>
+      <w:lvlJc w:val="left"/>
+      <w:pPr>
+        <w:tabs>
+          <w:tab w:val="num" w:pos="1440"/>
+        </w:tabs>
+        <w:ind w:left="1440" w:hanging="360"/>
+      </w:pPr>
+      <w:rPr>
+        <w:rFonts w:ascii="Symbol" w:hAnsi="Symbol" w:hint="default"/>
+        <w:sz w:val="20"/>
+      </w:rPr>
+    </w:lvl>
+    <w:lvl w:ilvl="2" w:tentative="1">
+      <w:start w:val="1"/>
+      <w:numFmt w:val="bullet"/>
+      <w:lvlText w:val=""/>
+      <w:lvlJc w:val="left"/>
+      <w:pPr>
+        <w:tabs>
+          <w:tab w:val="num" w:pos="2160"/>
+        </w:tabs>
+        <w:ind w:left="2160" w:hanging="360"/>
+      </w:pPr>
+      <w:rPr>
+        <w:rFonts w:ascii="Symbol" w:hAnsi="Symbol" w:hint="default"/>
+        <w:sz w:val="20"/>
+      </w:rPr>
+    </w:lvl>
+    <w:lvl w:ilvl="3" w:tentative="1">
+      <w:start w:val="1"/>
+      <w:numFmt w:val="bullet"/>
+      <w:lvlText w:val=""/>
+      <w:lvlJc w:val="left"/>
+      <w:pPr>
+        <w:tabs>
+          <w:tab w:val="num" w:pos="2880"/>
+        </w:tabs>
+        <w:ind w:left="2880" w:hanging="360"/>
+      </w:pPr>
+      <w:rPr>
+        <w:rFonts w:ascii="Symbol" w:hAnsi="Symbol" w:hint="default"/>
+        <w:sz w:val="20"/>
+      </w:rPr>
+    </w:lvl>
+    <w:lvl w:ilvl="4" w:tentative="1">
+      <w:start w:val="1"/>
+      <w:numFmt w:val="bullet"/>
+      <w:lvlText w:val=""/>
+      <w:lvlJc w:val="left"/>
+      <w:pPr>
+        <w:tabs>
+          <w:tab w:val="num" w:pos="3600"/>
+        </w:tabs>
+        <w:ind w:left="3600" w:hanging="360"/>
+      </w:pPr>
+      <w:rPr>
+        <w:rFonts w:ascii="Symbol" w:hAnsi="Symbol" w:hint="default"/>
+        <w:sz w:val="20"/>
+      </w:rPr>
+    </w:lvl>
+    <w:lvl w:ilvl="5" w:tentative="1">
+      <w:start w:val="1"/>
+      <w:numFmt w:val="bullet"/>
+      <w:lvlText w:val=""/>
+      <w:lvlJc w:val="left"/>
+      <w:pPr>
+        <w:tabs>
+          <w:tab w:val="num" w:pos="4320"/>
+        </w:tabs>
+        <w:ind w:left="4320" w:hanging="360"/>
+      </w:pPr>
+      <w:rPr>
+        <w:rFonts w:ascii="Symbol" w:hAnsi="Symbol" w:hint="default"/>
+        <w:sz w:val="20"/>
+      </w:rPr>
+    </w:lvl>
+    <w:lvl w:ilvl="6" w:tentative="1">
+      <w:start w:val="1"/>
+      <w:numFmt w:val="bullet"/>
+      <w:lvlText w:val=""/>
+      <w:lvlJc w:val="left"/>
+      <w:pPr>
+        <w:tabs>
+          <w:tab w:val="num" w:pos="5040"/>
+        </w:tabs>
+        <w:ind w:left="5040" w:hanging="360"/>
+      </w:pPr>
+      <w:rPr>
+        <w:rFonts w:ascii="Symbol" w:hAnsi="Symbol" w:hint="default"/>
+        <w:sz w:val="20"/>
+      </w:rPr>
+    </w:lvl>
+    <w:lvl w:ilvl="7" w:tentative="1">
+      <w:start w:val="1"/>
+      <w:numFmt w:val="bullet"/>
+      <w:lvlText w:val=""/>
+      <w:lvlJc w:val="left"/>
+      <w:pPr>
+        <w:tabs>
+          <w:tab w:val="num" w:pos="5760"/>
+        </w:tabs>
+        <w:ind w:left="5760" w:hanging="360"/>
+      </w:pPr>
+      <w:rPr>
+        <w:rFonts w:ascii="Symbol" w:hAnsi="Symbol" w:hint="default"/>
+        <w:sz w:val="20"/>
+      </w:rPr>
+    </w:lvl>
+    <w:lvl w:ilvl="8" w:tentative="1">
+      <w:start w:val="1"/>
+      <w:numFmt w:val="bullet"/>
+      <w:lvlText w:val=""/>
+      <w:lvlJc w:val="left"/>
+      <w:pPr>
+        <w:tabs>
+          <w:tab w:val="num" w:pos="6480"/>
+        </w:tabs>
+        <w:ind w:left="6480" w:hanging="360"/>
+      </w:pPr>
+      <w:rPr>
+        <w:rFonts w:ascii="Symbol" w:hAnsi="Symbol" w:hint="default"/>
+        <w:sz w:val="20"/>
+      </w:rPr>
+    </w:lvl>
+  </w:abstractNum>
+  <w:abstractNum w:abstractNumId="10" w15:restartNumberingAfterBreak="0">
     <w:nsid w:val="2CCC4FE3"/>
     <w:multiLevelType w:val="hybridMultilevel"/>
     <w:tmpl w:val="74C408D4"/>
@@ -1005,7 +1260,7 @@
       </w:rPr>
     </w:lvl>
   </w:abstractNum>
-  <w:abstractNum w:abstractNumId="10" w15:restartNumberingAfterBreak="0">
+  <w:abstractNum w:abstractNumId="11" w15:restartNumberingAfterBreak="0">
     <w:nsid w:val="32A77D1B"/>
     <w:multiLevelType w:val="hybridMultilevel"/>
     <w:tmpl w:val="0C4ADA0C"/>
@@ -1116,6 +1371,119 @@
       <w:rPr>
         <w:rFonts w:ascii="Wingdings" w:hAnsi="Wingdings" w:hint="default"/>
       </w:rPr>
+    </w:lvl>
+  </w:abstractNum>
+  <w:abstractNum w:abstractNumId="12" w15:restartNumberingAfterBreak="0">
+    <w:nsid w:val="4B3C0C19"/>
+    <w:multiLevelType w:val="multilevel"/>
+    <w:tmpl w:val="79342806"/>
+    <w:lvl w:ilvl="0">
+      <w:start w:val="1"/>
+      <w:numFmt w:val="decimal"/>
+      <w:lvlText w:val="%1."/>
+      <w:lvlJc w:val="left"/>
+      <w:pPr>
+        <w:tabs>
+          <w:tab w:val="num" w:pos="720"/>
+        </w:tabs>
+        <w:ind w:left="720" w:hanging="360"/>
+      </w:pPr>
+    </w:lvl>
+    <w:lvl w:ilvl="1">
+      <w:start w:val="3"/>
+      <w:numFmt w:val="bullet"/>
+      <w:lvlText w:val="-"/>
+      <w:lvlJc w:val="left"/>
+      <w:pPr>
+        <w:ind w:left="1440" w:hanging="360"/>
+      </w:pPr>
+      <w:rPr>
+        <w:rFonts w:ascii="Cambria" w:eastAsia="맑은 고딕" w:hAnsi="Cambria" w:cstheme="minorBidi" w:hint="default"/>
+      </w:rPr>
+    </w:lvl>
+    <w:lvl w:ilvl="2" w:tentative="1">
+      <w:start w:val="1"/>
+      <w:numFmt w:val="decimal"/>
+      <w:lvlText w:val="%3."/>
+      <w:lvlJc w:val="left"/>
+      <w:pPr>
+        <w:tabs>
+          <w:tab w:val="num" w:pos="2160"/>
+        </w:tabs>
+        <w:ind w:left="2160" w:hanging="360"/>
+      </w:pPr>
+    </w:lvl>
+    <w:lvl w:ilvl="3" w:tentative="1">
+      <w:start w:val="1"/>
+      <w:numFmt w:val="decimal"/>
+      <w:lvlText w:val="%4."/>
+      <w:lvlJc w:val="left"/>
+      <w:pPr>
+        <w:tabs>
+          <w:tab w:val="num" w:pos="2880"/>
+        </w:tabs>
+        <w:ind w:left="2880" w:hanging="360"/>
+      </w:pPr>
+    </w:lvl>
+    <w:lvl w:ilvl="4" w:tentative="1">
+      <w:start w:val="1"/>
+      <w:numFmt w:val="decimal"/>
+      <w:lvlText w:val="%5."/>
+      <w:lvlJc w:val="left"/>
+      <w:pPr>
+        <w:tabs>
+          <w:tab w:val="num" w:pos="3600"/>
+        </w:tabs>
+        <w:ind w:left="3600" w:hanging="360"/>
+      </w:pPr>
+    </w:lvl>
+    <w:lvl w:ilvl="5" w:tentative="1">
+      <w:start w:val="1"/>
+      <w:numFmt w:val="decimal"/>
+      <w:lvlText w:val="%6."/>
+      <w:lvlJc w:val="left"/>
+      <w:pPr>
+        <w:tabs>
+          <w:tab w:val="num" w:pos="4320"/>
+        </w:tabs>
+        <w:ind w:left="4320" w:hanging="360"/>
+      </w:pPr>
+    </w:lvl>
+    <w:lvl w:ilvl="6" w:tentative="1">
+      <w:start w:val="1"/>
+      <w:numFmt w:val="decimal"/>
+      <w:lvlText w:val="%7."/>
+      <w:lvlJc w:val="left"/>
+      <w:pPr>
+        <w:tabs>
+          <w:tab w:val="num" w:pos="5040"/>
+        </w:tabs>
+        <w:ind w:left="5040" w:hanging="360"/>
+      </w:pPr>
+    </w:lvl>
+    <w:lvl w:ilvl="7" w:tentative="1">
+      <w:start w:val="1"/>
+      <w:numFmt w:val="decimal"/>
+      <w:lvlText w:val="%8."/>
+      <w:lvlJc w:val="left"/>
+      <w:pPr>
+        <w:tabs>
+          <w:tab w:val="num" w:pos="5760"/>
+        </w:tabs>
+        <w:ind w:left="5760" w:hanging="360"/>
+      </w:pPr>
+    </w:lvl>
+    <w:lvl w:ilvl="8" w:tentative="1">
+      <w:start w:val="1"/>
+      <w:numFmt w:val="decimal"/>
+      <w:lvlText w:val="%9."/>
+      <w:lvlJc w:val="left"/>
+      <w:pPr>
+        <w:tabs>
+          <w:tab w:val="num" w:pos="6480"/>
+        </w:tabs>
+        <w:ind w:left="6480" w:hanging="360"/>
+      </w:pPr>
     </w:lvl>
   </w:abstractNum>
   <w:num w:numId="1" w16cid:durableId="1387532221">
@@ -1146,9 +1514,15 @@
     <w:abstractNumId w:val="0"/>
   </w:num>
   <w:num w:numId="10" w16cid:durableId="2042516123">
+    <w:abstractNumId w:val="11"/>
+  </w:num>
+  <w:num w:numId="11" w16cid:durableId="931620582">
     <w:abstractNumId w:val="10"/>
   </w:num>
-  <w:num w:numId="11" w16cid:durableId="931620582">
+  <w:num w:numId="12" w16cid:durableId="1825924828">
+    <w:abstractNumId w:val="12"/>
+  </w:num>
+  <w:num w:numId="13" w16cid:durableId="736322793">
     <w:abstractNumId w:val="9"/>
   </w:num>
 </w:numbering>
@@ -1757,7 +2131,6 @@
   <w:style w:type="character" w:default="1" w:styleId="DefaultParagraphFont">
     <w:name w:val="Default Paragraph Font"/>
     <w:uiPriority w:val="1"/>
-    <w:semiHidden/>
     <w:unhideWhenUsed/>
   </w:style>
   <w:style w:type="table" w:default="1" w:styleId="TableNormal">

</xml_diff>

<commit_message>
Reorganize QA test case library
- restructure test cases into API, Authentication, BibleReading, CommunitySystem, and DB folders

- add leader notification bug report artifacts and refresh supporting bug report docs

- update notification coverage workbooks and validation assets for cleaner QA navigation
</commit_message>
<xml_diff>
--- a/qa-docs/bug-reports/Bug_Report_Template.docx
+++ b/qa-docs/bug-reports/Bug_Report_Template.docx
@@ -5,13 +5,19 @@
     <w:p>
       <w:pPr>
         <w:jc w:val="center"/>
+        <w:rPr>
+          <w:rFonts w:eastAsia="맑은 고딕" w:hint="eastAsia"/>
+          <w:lang w:eastAsia="ko-KR"/>
+        </w:rPr>
       </w:pPr>
       <w:r>
         <w:rPr>
+          <w:rFonts w:eastAsia="맑은 고딕" w:hint="eastAsia"/>
           <w:b/>
           <w:sz w:val="40"/>
+          <w:lang w:eastAsia="ko-KR"/>
         </w:rPr>
-        <w:t>Bug Report Template</w:t>
+        <w:t>Declined join request redirection</w:t>
       </w:r>
     </w:p>
     <w:p>
@@ -30,67 +36,26 @@
     </w:p>
     <w:p>
       <w:pPr>
-        <w:ind w:left="240"/>
         <w:rPr>
           <w:rFonts w:eastAsia="맑은 고딕"/>
           <w:lang w:eastAsia="ko-KR"/>
         </w:rPr>
       </w:pPr>
-      <w:r>
-        <w:rPr>
-          <w:rFonts w:eastAsia="맑은 고딕" w:hint="eastAsia"/>
-          <w:lang w:eastAsia="ko-KR"/>
-        </w:rPr>
-        <w:t>Community</w:t>
-      </w:r>
-      <w:r>
-        <w:rPr>
-          <w:rFonts w:eastAsia="맑은 고딕" w:hint="eastAsia"/>
-          <w:lang w:eastAsia="ko-KR"/>
-        </w:rPr>
-        <w:t>_</w:t>
-      </w:r>
-      <w:r>
-        <w:rPr>
-          <w:rFonts w:eastAsia="맑은 고딕" w:hint="eastAsia"/>
-          <w:lang w:eastAsia="ko-KR"/>
-        </w:rPr>
-        <w:t>Core</w:t>
-      </w:r>
-      <w:r>
-        <w:rPr>
-          <w:rFonts w:eastAsia="맑은 고딕" w:hint="eastAsia"/>
-          <w:lang w:eastAsia="ko-KR"/>
-        </w:rPr>
-        <w:t xml:space="preserve"> </w:t>
-      </w:r>
+      <w:proofErr w:type="spellStart"/>
       <w:r>
         <w:rPr>
           <w:rFonts w:eastAsia="맑은 고딕"/>
           <w:lang w:eastAsia="ko-KR"/>
         </w:rPr>
-        <w:t>–</w:t>
+        <w:t>Community_Core</w:t>
       </w:r>
+      <w:proofErr w:type="spellEnd"/>
       <w:r>
         <w:rPr>
-          <w:rFonts w:eastAsia="맑은 고딕" w:hint="eastAsia"/>
+          <w:rFonts w:eastAsia="맑은 고딕"/>
           <w:lang w:eastAsia="ko-KR"/>
         </w:rPr>
-        <w:t xml:space="preserve"> [</w:t>
-      </w:r>
-      <w:r>
-        <w:rPr>
-          <w:rFonts w:eastAsia="맑은 고딕" w:hint="eastAsia"/>
-          <w:lang w:eastAsia="ko-KR"/>
-        </w:rPr>
-        <w:t>1</w:t>
-      </w:r>
-      <w:r>
-        <w:rPr>
-          <w:rFonts w:eastAsia="맑은 고딕" w:hint="eastAsia"/>
-          <w:lang w:eastAsia="ko-KR"/>
-        </w:rPr>
-        <w:t>]</w:t>
+        <w:t xml:space="preserve"> – [3]</w:t>
       </w:r>
     </w:p>
     <w:p>
@@ -104,18 +69,17 @@
     </w:p>
     <w:p>
       <w:pPr>
-        <w:ind w:left="240"/>
         <w:rPr>
-          <w:rFonts w:eastAsia="맑은 고딕" w:hint="eastAsia"/>
+          <w:rFonts w:eastAsia="맑은 고딕"/>
           <w:lang w:eastAsia="ko-KR"/>
         </w:rPr>
       </w:pPr>
       <w:r>
         <w:rPr>
-          <w:rFonts w:eastAsia="맑은 고딕" w:hint="eastAsia"/>
+          <w:rFonts w:eastAsia="맑은 고딕"/>
           <w:lang w:eastAsia="ko-KR"/>
         </w:rPr>
-        <w:t>Community Title edit not implemented</w:t>
+        <w:t>Declined join request notification redirects to the wrong page instead of community info</w:t>
       </w:r>
     </w:p>
     <w:p>
@@ -235,47 +199,87 @@
     </w:p>
     <w:p>
       <w:pPr>
-        <w:ind w:left="240"/>
+        <w:numPr>
+          <w:ilvl w:val="0"/>
+          <w:numId w:val="20"/>
+        </w:numPr>
         <w:rPr>
-          <w:rFonts w:eastAsia="맑은 고딕"/>
-          <w:lang w:eastAsia="ko-KR"/>
+          <w:lang w:val="en-CA"/>
         </w:rPr>
       </w:pPr>
-      <w:r>
-        <w:t>1.</w:t>
-      </w:r>
       <w:r>
         <w:rPr>
-          <w:rFonts w:eastAsia="맑은 고딕" w:hint="eastAsia"/>
-          <w:lang w:eastAsia="ko-KR"/>
+          <w:lang w:val="en-CA"/>
         </w:rPr>
-        <w:t xml:space="preserve"> Have a registered Verse by Verse Account</w:t>
+        <w:t>Have a registered Verse by Verse account for a requester</w:t>
       </w:r>
     </w:p>
     <w:p>
       <w:pPr>
-        <w:ind w:left="240"/>
+        <w:numPr>
+          <w:ilvl w:val="0"/>
+          <w:numId w:val="20"/>
+        </w:numPr>
         <w:rPr>
-          <w:rFonts w:eastAsia="맑은 고딕" w:hint="eastAsia"/>
-          <w:lang w:eastAsia="ko-KR"/>
+          <w:lang w:val="en-CA"/>
         </w:rPr>
       </w:pPr>
-      <w:r>
-        <w:t>2.</w:t>
-      </w:r>
       <w:r>
         <w:rPr>
-          <w:rFonts w:eastAsia="맑은 고딕" w:hint="eastAsia"/>
-          <w:lang w:eastAsia="ko-KR"/>
+          <w:lang w:val="en-CA"/>
         </w:rPr>
-        <w:t xml:space="preserve"> Have a community created </w:t>
+        <w:t>Have a registered Verse by Verse account for a community owner or authorized leader</w:t>
       </w:r>
+    </w:p>
+    <w:p>
+      <w:pPr>
+        <w:numPr>
+          <w:ilvl w:val="0"/>
+          <w:numId w:val="20"/>
+        </w:numPr>
+        <w:rPr>
+          <w:lang w:val="en-CA"/>
+        </w:rPr>
+      </w:pPr>
       <w:r>
         <w:rPr>
-          <w:rFonts w:eastAsia="맑은 고딕" w:hint="eastAsia"/>
-          <w:lang w:eastAsia="ko-KR"/>
+          <w:lang w:val="en-CA"/>
         </w:rPr>
-        <w:t>(Owner permission)</w:t>
+        <w:t>Have an existing community that the requester is not a member of</w:t>
+      </w:r>
+    </w:p>
+    <w:p>
+      <w:pPr>
+        <w:numPr>
+          <w:ilvl w:val="0"/>
+          <w:numId w:val="20"/>
+        </w:numPr>
+        <w:rPr>
+          <w:lang w:val="en-CA"/>
+        </w:rPr>
+      </w:pPr>
+      <w:r>
+        <w:rPr>
+          <w:lang w:val="en-CA"/>
+        </w:rPr>
+        <w:t>Submit a join request for that community</w:t>
+      </w:r>
+    </w:p>
+    <w:p>
+      <w:pPr>
+        <w:numPr>
+          <w:ilvl w:val="0"/>
+          <w:numId w:val="20"/>
+        </w:numPr>
+        <w:rPr>
+          <w:lang w:val="en-CA"/>
+        </w:rPr>
+      </w:pPr>
+      <w:r>
+        <w:rPr>
+          <w:lang w:val="en-CA"/>
+        </w:rPr>
+        <w:t>Decline the requester’s join request so the requester receives a decline notification</w:t>
       </w:r>
     </w:p>
     <w:p>
@@ -291,7 +295,7 @@
       <w:pPr>
         <w:numPr>
           <w:ilvl w:val="0"/>
-          <w:numId w:val="12"/>
+          <w:numId w:val="21"/>
         </w:numPr>
         <w:rPr>
           <w:lang w:val="en-CA"/>
@@ -301,14 +305,14 @@
         <w:rPr>
           <w:lang w:val="en-CA"/>
         </w:rPr>
-        <w:t>Sign in as the owner of an existing community.</w:t>
+        <w:t>Sign in as the requester account.</w:t>
       </w:r>
     </w:p>
     <w:p>
       <w:pPr>
         <w:numPr>
           <w:ilvl w:val="0"/>
-          <w:numId w:val="12"/>
+          <w:numId w:val="21"/>
         </w:numPr>
         <w:rPr>
           <w:lang w:val="en-CA"/>
@@ -318,14 +322,14 @@
         <w:rPr>
           <w:lang w:val="en-CA"/>
         </w:rPr>
-        <w:t>Go to the community posts page: /community/:id/my-posts.</w:t>
+        <w:t>Open /notifications.</w:t>
       </w:r>
     </w:p>
     <w:p>
       <w:pPr>
         <w:numPr>
           <w:ilvl w:val="0"/>
-          <w:numId w:val="12"/>
+          <w:numId w:val="21"/>
         </w:numPr>
         <w:rPr>
           <w:lang w:val="en-CA"/>
@@ -335,14 +339,14 @@
         <w:rPr>
           <w:lang w:val="en-CA"/>
         </w:rPr>
-        <w:t>Confirm the Edit Details button appears near Manage and New Post.</w:t>
+        <w:t>Locate the notification indicating that the join request was declined.</w:t>
       </w:r>
     </w:p>
     <w:p>
       <w:pPr>
         <w:numPr>
           <w:ilvl w:val="0"/>
-          <w:numId w:val="12"/>
+          <w:numId w:val="21"/>
         </w:numPr>
         <w:rPr>
           <w:lang w:val="en-CA"/>
@@ -352,92 +356,7 @@
         <w:rPr>
           <w:lang w:val="en-CA"/>
         </w:rPr>
-        <w:t>Click Edit Details.</w:t>
-      </w:r>
-    </w:p>
-    <w:p>
-      <w:pPr>
-        <w:numPr>
-          <w:ilvl w:val="0"/>
-          <w:numId w:val="12"/>
-        </w:numPr>
-        <w:rPr>
-          <w:lang w:val="en-CA"/>
-        </w:rPr>
-      </w:pPr>
-      <w:r>
-        <w:rPr>
-          <w:lang w:val="en-CA"/>
-        </w:rPr>
-        <w:t>Update Community title, Subtitle or purpose, and/or Description.</w:t>
-      </w:r>
-    </w:p>
-    <w:p>
-      <w:pPr>
-        <w:numPr>
-          <w:ilvl w:val="0"/>
-          <w:numId w:val="12"/>
-        </w:numPr>
-        <w:rPr>
-          <w:lang w:val="en-CA"/>
-        </w:rPr>
-      </w:pPr>
-      <w:r>
-        <w:rPr>
-          <w:lang w:val="en-CA"/>
-        </w:rPr>
-        <w:t>Click Save details.</w:t>
-      </w:r>
-    </w:p>
-    <w:p>
-      <w:pPr>
-        <w:numPr>
-          <w:ilvl w:val="0"/>
-          <w:numId w:val="12"/>
-        </w:numPr>
-        <w:rPr>
-          <w:lang w:val="en-CA"/>
-        </w:rPr>
-      </w:pPr>
-      <w:r>
-        <w:rPr>
-          <w:lang w:val="en-CA"/>
-        </w:rPr>
-        <w:t>Confirm the success toast appears.</w:t>
-      </w:r>
-    </w:p>
-    <w:p>
-      <w:pPr>
-        <w:numPr>
-          <w:ilvl w:val="0"/>
-          <w:numId w:val="12"/>
-        </w:numPr>
-        <w:rPr>
-          <w:lang w:val="en-CA"/>
-        </w:rPr>
-      </w:pPr>
-      <w:r>
-        <w:rPr>
-          <w:lang w:val="en-CA"/>
-        </w:rPr>
-        <w:t>Confirm the hero title/subtitle update on the same /my-posts page.</w:t>
-      </w:r>
-    </w:p>
-    <w:p>
-      <w:pPr>
-        <w:numPr>
-          <w:ilvl w:val="0"/>
-          <w:numId w:val="12"/>
-        </w:numPr>
-        <w:rPr>
-          <w:lang w:val="en-CA"/>
-        </w:rPr>
-      </w:pPr>
-      <w:r>
-        <w:rPr>
-          <w:lang w:val="en-CA"/>
-        </w:rPr>
-        <w:t>Refresh the page and confirm the updated values persist.</w:t>
+        <w:t>Click the declined join request notification.</w:t>
       </w:r>
     </w:p>
     <w:p>
@@ -446,7 +365,17 @@
           <w:rFonts w:eastAsia="맑은 고딕"/>
           <w:b/>
           <w:sz w:val="24"/>
-          <w:lang w:eastAsia="ko-KR"/>
+          <w:lang w:val="en-CA" w:eastAsia="ko-KR"/>
+        </w:rPr>
+      </w:pPr>
+    </w:p>
+    <w:p>
+      <w:pPr>
+        <w:rPr>
+          <w:rFonts w:eastAsia="맑은 고딕"/>
+          <w:b/>
+          <w:sz w:val="24"/>
+          <w:lang w:val="en-CA" w:eastAsia="ko-KR"/>
         </w:rPr>
       </w:pPr>
     </w:p>
@@ -470,7 +399,7 @@
       <w:pPr>
         <w:numPr>
           <w:ilvl w:val="0"/>
-          <w:numId w:val="13"/>
+          <w:numId w:val="22"/>
         </w:numPr>
         <w:rPr>
           <w:rFonts w:eastAsia="맑은 고딕"/>
@@ -486,14 +415,14 @@
           <w:sz w:val="24"/>
           <w:lang w:val="en-CA" w:eastAsia="ko-KR"/>
         </w:rPr>
-        <w:t>Only the community owner can see Edit Details on /community/:id/my-posts.</w:t>
+        <w:t>Clicking the declined join request notification should redirect the user to the community info page for that community.</w:t>
       </w:r>
     </w:p>
     <w:p>
       <w:pPr>
         <w:numPr>
           <w:ilvl w:val="0"/>
-          <w:numId w:val="13"/>
+          <w:numId w:val="22"/>
         </w:numPr>
         <w:rPr>
           <w:rFonts w:eastAsia="맑은 고딕"/>
@@ -509,14 +438,14 @@
           <w:sz w:val="24"/>
           <w:lang w:val="en-CA" w:eastAsia="ko-KR"/>
         </w:rPr>
-        <w:t>Clicking Edit Details opens an inline edit panel with the current title, subtitle, and description prefilled.</w:t>
+        <w:t>The destination should be the page where the user can view community details and submit another join request if allowed.</w:t>
       </w:r>
     </w:p>
     <w:p>
       <w:pPr>
         <w:numPr>
           <w:ilvl w:val="0"/>
-          <w:numId w:val="13"/>
+          <w:numId w:val="22"/>
         </w:numPr>
         <w:rPr>
           <w:rFonts w:eastAsia="맑은 고딕"/>
@@ -532,85 +461,62 @@
           <w:sz w:val="24"/>
           <w:lang w:val="en-CA" w:eastAsia="ko-KR"/>
         </w:rPr>
-        <w:t>Saving sends PATCH /community/:id with header, subheader, and content.</w:t>
+        <w:t>Expected route pattern: /community/:id/info</w:t>
       </w:r>
     </w:p>
     <w:p>
       <w:pPr>
-        <w:numPr>
-          <w:ilvl w:val="0"/>
-          <w:numId w:val="13"/>
-        </w:numPr>
         <w:rPr>
           <w:rFonts w:eastAsia="맑은 고딕"/>
-          <w:bCs/>
+          <w:b/>
           <w:sz w:val="24"/>
-          <w:lang w:val="en-CA" w:eastAsia="ko-KR"/>
+          <w:lang w:eastAsia="ko-KR"/>
         </w:rPr>
       </w:pPr>
-      <w:r>
-        <w:rPr>
-          <w:rFonts w:eastAsia="맑은 고딕"/>
-          <w:bCs/>
-          <w:sz w:val="24"/>
-          <w:lang w:val="en-CA" w:eastAsia="ko-KR"/>
-        </w:rPr>
-        <w:t>If the save succeeds, the panel closes, a success toast appears, and the /my-posts hero title/subtitle update immediately.</w:t>
-      </w:r>
-    </w:p>
-    <w:p>
-      <w:pPr>
-        <w:numPr>
-          <w:ilvl w:val="0"/>
-          <w:numId w:val="13"/>
-        </w:numPr>
-        <w:rPr>
-          <w:rFonts w:eastAsia="맑은 고딕"/>
-          <w:bCs/>
-          <w:sz w:val="24"/>
-          <w:lang w:val="en-CA" w:eastAsia="ko-KR"/>
-        </w:rPr>
-      </w:pPr>
-      <w:r>
-        <w:rPr>
-          <w:rFonts w:eastAsia="맑은 고딕"/>
-          <w:bCs/>
-          <w:sz w:val="24"/>
-          <w:lang w:val="en-CA" w:eastAsia="ko-KR"/>
-        </w:rPr>
-        <w:t>The updated description should persist after refresh and appear wherever the community description is displayed.</w:t>
-      </w:r>
-    </w:p>
-    <w:p>
-      <w:pPr>
-        <w:numPr>
-          <w:ilvl w:val="0"/>
-          <w:numId w:val="13"/>
-        </w:numPr>
-        <w:rPr>
-          <w:rFonts w:eastAsia="맑은 고딕"/>
-          <w:bCs/>
-          <w:sz w:val="24"/>
-          <w:lang w:val="en-CA" w:eastAsia="ko-KR"/>
-        </w:rPr>
-      </w:pPr>
-      <w:r>
-        <w:rPr>
-          <w:rFonts w:eastAsia="맑은 고딕"/>
-          <w:bCs/>
-          <w:sz w:val="24"/>
-          <w:lang w:val="en-CA" w:eastAsia="ko-KR"/>
-        </w:rPr>
-        <w:t>If validation fails or the API returns an error, the panel stays open and shows an error without losing the entered text.</w:t>
-      </w:r>
-    </w:p>
-    <w:p>
       <w:r>
         <w:rPr>
           <w:b/>
           <w:sz w:val="24"/>
         </w:rPr>
         <w:t>Actual Result:</w:t>
+      </w:r>
+    </w:p>
+    <w:p>
+      <w:pPr>
+        <w:numPr>
+          <w:ilvl w:val="0"/>
+          <w:numId w:val="23"/>
+        </w:numPr>
+        <w:rPr>
+          <w:rFonts w:eastAsia="맑은 고딕"/>
+          <w:lang w:val="en-CA" w:eastAsia="ko-KR"/>
+        </w:rPr>
+      </w:pPr>
+      <w:r>
+        <w:rPr>
+          <w:rFonts w:eastAsia="맑은 고딕"/>
+          <w:lang w:val="en-CA" w:eastAsia="ko-KR"/>
+        </w:rPr>
+        <w:t>Clicking the declined join request notification does not redirect to the community info page.</w:t>
+      </w:r>
+    </w:p>
+    <w:p>
+      <w:pPr>
+        <w:numPr>
+          <w:ilvl w:val="0"/>
+          <w:numId w:val="23"/>
+        </w:numPr>
+        <w:rPr>
+          <w:rFonts w:eastAsia="맑은 고딕"/>
+          <w:lang w:val="en-CA" w:eastAsia="ko-KR"/>
+        </w:rPr>
+      </w:pPr>
+      <w:r>
+        <w:rPr>
+          <w:rFonts w:eastAsia="맑은 고딕"/>
+          <w:lang w:val="en-CA" w:eastAsia="ko-KR"/>
+        </w:rPr>
+        <w:t>The notification currently routes the user to the wrong community destination.</w:t>
       </w:r>
     </w:p>
     <w:p>
@@ -626,7 +532,7 @@
       <w:pPr>
         <w:ind w:left="240"/>
         <w:rPr>
-          <w:rFonts w:eastAsia="맑은 고딕" w:hint="eastAsia"/>
+          <w:rFonts w:eastAsia="맑은 고딕"/>
           <w:lang w:eastAsia="ko-KR"/>
         </w:rPr>
       </w:pPr>
@@ -704,54 +610,12 @@
     <w:p>
       <w:pPr>
         <w:rPr>
-          <w:rFonts w:eastAsia="맑은 고딕" w:hint="eastAsia"/>
+          <w:rFonts w:eastAsia="맑은 고딕"/>
+          <w:b/>
+          <w:sz w:val="24"/>
           <w:lang w:eastAsia="ko-KR"/>
         </w:rPr>
       </w:pPr>
-      <w:r>
-        <w:rPr>
-          <w:rFonts w:eastAsia="맑은 고딕"/>
-          <w:lang w:eastAsia="ko-KR"/>
-        </w:rPr>
-        <w:lastRenderedPageBreak/>
-        <w:drawing>
-          <wp:inline distT="0" distB="0" distL="0" distR="0" wp14:anchorId="7D7DF2EB" wp14:editId="0C6ABFDE">
-            <wp:extent cx="4562475" cy="3343175"/>
-            <wp:effectExtent l="0" t="0" r="0" b="0"/>
-            <wp:docPr id="1383624141" name="Picture 1"/>
-            <wp:cNvGraphicFramePr>
-              <a:graphicFrameLocks xmlns:a="http://schemas.openxmlformats.org/drawingml/2006/main" noChangeAspect="1"/>
-            </wp:cNvGraphicFramePr>
-            <a:graphic xmlns:a="http://schemas.openxmlformats.org/drawingml/2006/main">
-              <a:graphicData uri="http://schemas.openxmlformats.org/drawingml/2006/picture">
-                <pic:pic xmlns:pic="http://schemas.openxmlformats.org/drawingml/2006/picture">
-                  <pic:nvPicPr>
-                    <pic:cNvPr id="1383624141" name=""/>
-                    <pic:cNvPicPr/>
-                  </pic:nvPicPr>
-                  <pic:blipFill>
-                    <a:blip r:embed="rId8"/>
-                    <a:stretch>
-                      <a:fillRect/>
-                    </a:stretch>
-                  </pic:blipFill>
-                  <pic:spPr>
-                    <a:xfrm>
-                      <a:off x="0" y="0"/>
-                      <a:ext cx="4597142" cy="3368577"/>
-                    </a:xfrm>
-                    <a:prstGeom prst="rect">
-                      <a:avLst/>
-                    </a:prstGeom>
-                  </pic:spPr>
-                </pic:pic>
-              </a:graphicData>
-            </a:graphic>
-          </wp:inline>
-        </w:drawing>
-      </w:r>
-    </w:p>
-    <w:p>
       <w:r>
         <w:rPr>
           <w:b/>
@@ -759,6 +623,33 @@
         </w:rPr>
         <w:t>Notes / Root Cause (Optional):</w:t>
       </w:r>
+    </w:p>
+    <w:p>
+      <w:pPr>
+        <w:numPr>
+          <w:ilvl w:val="0"/>
+          <w:numId w:val="24"/>
+        </w:numPr>
+        <w:rPr>
+          <w:rFonts w:eastAsia="맑은 고딕"/>
+          <w:lang w:val="en-CA" w:eastAsia="ko-KR"/>
+        </w:rPr>
+      </w:pPr>
+      <w:r>
+        <w:rPr>
+          <w:rFonts w:eastAsia="맑은 고딕"/>
+          <w:lang w:val="en-CA" w:eastAsia="ko-KR"/>
+        </w:rPr>
+        <w:t>Notification routing logic likely falls back to a generic community route such as /community/:id/my-posts or another non-request page instead of using /community/:id/info for declined join request result notifications.</w:t>
+      </w:r>
+    </w:p>
+    <w:p>
+      <w:pPr>
+        <w:rPr>
+          <w:rFonts w:eastAsia="맑은 고딕"/>
+          <w:lang w:val="en-CA" w:eastAsia="ko-KR"/>
+        </w:rPr>
+      </w:pPr>
     </w:p>
     <w:p>
       <w:pPr>
@@ -1148,6 +1039,683 @@
     </w:lvl>
   </w:abstractNum>
   <w:abstractNum w:abstractNumId="10" w15:restartNumberingAfterBreak="0">
+    <w:nsid w:val="08A008B0"/>
+    <w:multiLevelType w:val="multilevel"/>
+    <w:tmpl w:val="F78421CA"/>
+    <w:lvl w:ilvl="0">
+      <w:start w:val="1"/>
+      <w:numFmt w:val="decimal"/>
+      <w:lvlText w:val="%1."/>
+      <w:lvlJc w:val="left"/>
+      <w:pPr>
+        <w:tabs>
+          <w:tab w:val="num" w:pos="720"/>
+        </w:tabs>
+        <w:ind w:left="720" w:hanging="360"/>
+      </w:pPr>
+    </w:lvl>
+    <w:lvl w:ilvl="1" w:tentative="1">
+      <w:start w:val="1"/>
+      <w:numFmt w:val="decimal"/>
+      <w:lvlText w:val="%2."/>
+      <w:lvlJc w:val="left"/>
+      <w:pPr>
+        <w:tabs>
+          <w:tab w:val="num" w:pos="1440"/>
+        </w:tabs>
+        <w:ind w:left="1440" w:hanging="360"/>
+      </w:pPr>
+    </w:lvl>
+    <w:lvl w:ilvl="2" w:tentative="1">
+      <w:start w:val="1"/>
+      <w:numFmt w:val="decimal"/>
+      <w:lvlText w:val="%3."/>
+      <w:lvlJc w:val="left"/>
+      <w:pPr>
+        <w:tabs>
+          <w:tab w:val="num" w:pos="2160"/>
+        </w:tabs>
+        <w:ind w:left="2160" w:hanging="360"/>
+      </w:pPr>
+    </w:lvl>
+    <w:lvl w:ilvl="3" w:tentative="1">
+      <w:start w:val="1"/>
+      <w:numFmt w:val="decimal"/>
+      <w:lvlText w:val="%4."/>
+      <w:lvlJc w:val="left"/>
+      <w:pPr>
+        <w:tabs>
+          <w:tab w:val="num" w:pos="2880"/>
+        </w:tabs>
+        <w:ind w:left="2880" w:hanging="360"/>
+      </w:pPr>
+    </w:lvl>
+    <w:lvl w:ilvl="4" w:tentative="1">
+      <w:start w:val="1"/>
+      <w:numFmt w:val="decimal"/>
+      <w:lvlText w:val="%5."/>
+      <w:lvlJc w:val="left"/>
+      <w:pPr>
+        <w:tabs>
+          <w:tab w:val="num" w:pos="3600"/>
+        </w:tabs>
+        <w:ind w:left="3600" w:hanging="360"/>
+      </w:pPr>
+    </w:lvl>
+    <w:lvl w:ilvl="5" w:tentative="1">
+      <w:start w:val="1"/>
+      <w:numFmt w:val="decimal"/>
+      <w:lvlText w:val="%6."/>
+      <w:lvlJc w:val="left"/>
+      <w:pPr>
+        <w:tabs>
+          <w:tab w:val="num" w:pos="4320"/>
+        </w:tabs>
+        <w:ind w:left="4320" w:hanging="360"/>
+      </w:pPr>
+    </w:lvl>
+    <w:lvl w:ilvl="6" w:tentative="1">
+      <w:start w:val="1"/>
+      <w:numFmt w:val="decimal"/>
+      <w:lvlText w:val="%7."/>
+      <w:lvlJc w:val="left"/>
+      <w:pPr>
+        <w:tabs>
+          <w:tab w:val="num" w:pos="5040"/>
+        </w:tabs>
+        <w:ind w:left="5040" w:hanging="360"/>
+      </w:pPr>
+    </w:lvl>
+    <w:lvl w:ilvl="7" w:tentative="1">
+      <w:start w:val="1"/>
+      <w:numFmt w:val="decimal"/>
+      <w:lvlText w:val="%8."/>
+      <w:lvlJc w:val="left"/>
+      <w:pPr>
+        <w:tabs>
+          <w:tab w:val="num" w:pos="5760"/>
+        </w:tabs>
+        <w:ind w:left="5760" w:hanging="360"/>
+      </w:pPr>
+    </w:lvl>
+    <w:lvl w:ilvl="8" w:tentative="1">
+      <w:start w:val="1"/>
+      <w:numFmt w:val="decimal"/>
+      <w:lvlText w:val="%9."/>
+      <w:lvlJc w:val="left"/>
+      <w:pPr>
+        <w:tabs>
+          <w:tab w:val="num" w:pos="6480"/>
+        </w:tabs>
+        <w:ind w:left="6480" w:hanging="360"/>
+      </w:pPr>
+    </w:lvl>
+  </w:abstractNum>
+  <w:abstractNum w:abstractNumId="11" w15:restartNumberingAfterBreak="0">
+    <w:nsid w:val="09BF2724"/>
+    <w:multiLevelType w:val="multilevel"/>
+    <w:tmpl w:val="AE6E509E"/>
+    <w:lvl w:ilvl="0">
+      <w:start w:val="1"/>
+      <w:numFmt w:val="bullet"/>
+      <w:lvlText w:val=""/>
+      <w:lvlJc w:val="left"/>
+      <w:pPr>
+        <w:tabs>
+          <w:tab w:val="num" w:pos="720"/>
+        </w:tabs>
+        <w:ind w:left="720" w:hanging="360"/>
+      </w:pPr>
+      <w:rPr>
+        <w:rFonts w:ascii="Symbol" w:hAnsi="Symbol" w:hint="default"/>
+        <w:sz w:val="20"/>
+      </w:rPr>
+    </w:lvl>
+    <w:lvl w:ilvl="1" w:tentative="1">
+      <w:start w:val="1"/>
+      <w:numFmt w:val="bullet"/>
+      <w:lvlText w:val=""/>
+      <w:lvlJc w:val="left"/>
+      <w:pPr>
+        <w:tabs>
+          <w:tab w:val="num" w:pos="1440"/>
+        </w:tabs>
+        <w:ind w:left="1440" w:hanging="360"/>
+      </w:pPr>
+      <w:rPr>
+        <w:rFonts w:ascii="Symbol" w:hAnsi="Symbol" w:hint="default"/>
+        <w:sz w:val="20"/>
+      </w:rPr>
+    </w:lvl>
+    <w:lvl w:ilvl="2" w:tentative="1">
+      <w:start w:val="1"/>
+      <w:numFmt w:val="bullet"/>
+      <w:lvlText w:val=""/>
+      <w:lvlJc w:val="left"/>
+      <w:pPr>
+        <w:tabs>
+          <w:tab w:val="num" w:pos="2160"/>
+        </w:tabs>
+        <w:ind w:left="2160" w:hanging="360"/>
+      </w:pPr>
+      <w:rPr>
+        <w:rFonts w:ascii="Symbol" w:hAnsi="Symbol" w:hint="default"/>
+        <w:sz w:val="20"/>
+      </w:rPr>
+    </w:lvl>
+    <w:lvl w:ilvl="3" w:tentative="1">
+      <w:start w:val="1"/>
+      <w:numFmt w:val="bullet"/>
+      <w:lvlText w:val=""/>
+      <w:lvlJc w:val="left"/>
+      <w:pPr>
+        <w:tabs>
+          <w:tab w:val="num" w:pos="2880"/>
+        </w:tabs>
+        <w:ind w:left="2880" w:hanging="360"/>
+      </w:pPr>
+      <w:rPr>
+        <w:rFonts w:ascii="Symbol" w:hAnsi="Symbol" w:hint="default"/>
+        <w:sz w:val="20"/>
+      </w:rPr>
+    </w:lvl>
+    <w:lvl w:ilvl="4" w:tentative="1">
+      <w:start w:val="1"/>
+      <w:numFmt w:val="bullet"/>
+      <w:lvlText w:val=""/>
+      <w:lvlJc w:val="left"/>
+      <w:pPr>
+        <w:tabs>
+          <w:tab w:val="num" w:pos="3600"/>
+        </w:tabs>
+        <w:ind w:left="3600" w:hanging="360"/>
+      </w:pPr>
+      <w:rPr>
+        <w:rFonts w:ascii="Symbol" w:hAnsi="Symbol" w:hint="default"/>
+        <w:sz w:val="20"/>
+      </w:rPr>
+    </w:lvl>
+    <w:lvl w:ilvl="5" w:tentative="1">
+      <w:start w:val="1"/>
+      <w:numFmt w:val="bullet"/>
+      <w:lvlText w:val=""/>
+      <w:lvlJc w:val="left"/>
+      <w:pPr>
+        <w:tabs>
+          <w:tab w:val="num" w:pos="4320"/>
+        </w:tabs>
+        <w:ind w:left="4320" w:hanging="360"/>
+      </w:pPr>
+      <w:rPr>
+        <w:rFonts w:ascii="Symbol" w:hAnsi="Symbol" w:hint="default"/>
+        <w:sz w:val="20"/>
+      </w:rPr>
+    </w:lvl>
+    <w:lvl w:ilvl="6" w:tentative="1">
+      <w:start w:val="1"/>
+      <w:numFmt w:val="bullet"/>
+      <w:lvlText w:val=""/>
+      <w:lvlJc w:val="left"/>
+      <w:pPr>
+        <w:tabs>
+          <w:tab w:val="num" w:pos="5040"/>
+        </w:tabs>
+        <w:ind w:left="5040" w:hanging="360"/>
+      </w:pPr>
+      <w:rPr>
+        <w:rFonts w:ascii="Symbol" w:hAnsi="Symbol" w:hint="default"/>
+        <w:sz w:val="20"/>
+      </w:rPr>
+    </w:lvl>
+    <w:lvl w:ilvl="7" w:tentative="1">
+      <w:start w:val="1"/>
+      <w:numFmt w:val="bullet"/>
+      <w:lvlText w:val=""/>
+      <w:lvlJc w:val="left"/>
+      <w:pPr>
+        <w:tabs>
+          <w:tab w:val="num" w:pos="5760"/>
+        </w:tabs>
+        <w:ind w:left="5760" w:hanging="360"/>
+      </w:pPr>
+      <w:rPr>
+        <w:rFonts w:ascii="Symbol" w:hAnsi="Symbol" w:hint="default"/>
+        <w:sz w:val="20"/>
+      </w:rPr>
+    </w:lvl>
+    <w:lvl w:ilvl="8" w:tentative="1">
+      <w:start w:val="1"/>
+      <w:numFmt w:val="bullet"/>
+      <w:lvlText w:val=""/>
+      <w:lvlJc w:val="left"/>
+      <w:pPr>
+        <w:tabs>
+          <w:tab w:val="num" w:pos="6480"/>
+        </w:tabs>
+        <w:ind w:left="6480" w:hanging="360"/>
+      </w:pPr>
+      <w:rPr>
+        <w:rFonts w:ascii="Symbol" w:hAnsi="Symbol" w:hint="default"/>
+        <w:sz w:val="20"/>
+      </w:rPr>
+    </w:lvl>
+  </w:abstractNum>
+  <w:abstractNum w:abstractNumId="12" w15:restartNumberingAfterBreak="0">
+    <w:nsid w:val="0E3530CC"/>
+    <w:multiLevelType w:val="multilevel"/>
+    <w:tmpl w:val="992EF5B8"/>
+    <w:lvl w:ilvl="0">
+      <w:start w:val="1"/>
+      <w:numFmt w:val="decimal"/>
+      <w:lvlText w:val="%1."/>
+      <w:lvlJc w:val="left"/>
+      <w:pPr>
+        <w:tabs>
+          <w:tab w:val="num" w:pos="720"/>
+        </w:tabs>
+        <w:ind w:left="720" w:hanging="360"/>
+      </w:pPr>
+    </w:lvl>
+    <w:lvl w:ilvl="1">
+      <w:start w:val="1"/>
+      <w:numFmt w:val="bullet"/>
+      <w:lvlText w:val=""/>
+      <w:lvlJc w:val="left"/>
+      <w:pPr>
+        <w:tabs>
+          <w:tab w:val="num" w:pos="1440"/>
+        </w:tabs>
+        <w:ind w:left="1440" w:hanging="360"/>
+      </w:pPr>
+      <w:rPr>
+        <w:rFonts w:ascii="Symbol" w:hAnsi="Symbol" w:hint="default"/>
+        <w:sz w:val="20"/>
+      </w:rPr>
+    </w:lvl>
+    <w:lvl w:ilvl="2" w:tentative="1">
+      <w:start w:val="1"/>
+      <w:numFmt w:val="decimal"/>
+      <w:lvlText w:val="%3."/>
+      <w:lvlJc w:val="left"/>
+      <w:pPr>
+        <w:tabs>
+          <w:tab w:val="num" w:pos="2160"/>
+        </w:tabs>
+        <w:ind w:left="2160" w:hanging="360"/>
+      </w:pPr>
+    </w:lvl>
+    <w:lvl w:ilvl="3" w:tentative="1">
+      <w:start w:val="1"/>
+      <w:numFmt w:val="decimal"/>
+      <w:lvlText w:val="%4."/>
+      <w:lvlJc w:val="left"/>
+      <w:pPr>
+        <w:tabs>
+          <w:tab w:val="num" w:pos="2880"/>
+        </w:tabs>
+        <w:ind w:left="2880" w:hanging="360"/>
+      </w:pPr>
+    </w:lvl>
+    <w:lvl w:ilvl="4" w:tentative="1">
+      <w:start w:val="1"/>
+      <w:numFmt w:val="decimal"/>
+      <w:lvlText w:val="%5."/>
+      <w:lvlJc w:val="left"/>
+      <w:pPr>
+        <w:tabs>
+          <w:tab w:val="num" w:pos="3600"/>
+        </w:tabs>
+        <w:ind w:left="3600" w:hanging="360"/>
+      </w:pPr>
+    </w:lvl>
+    <w:lvl w:ilvl="5" w:tentative="1">
+      <w:start w:val="1"/>
+      <w:numFmt w:val="decimal"/>
+      <w:lvlText w:val="%6."/>
+      <w:lvlJc w:val="left"/>
+      <w:pPr>
+        <w:tabs>
+          <w:tab w:val="num" w:pos="4320"/>
+        </w:tabs>
+        <w:ind w:left="4320" w:hanging="360"/>
+      </w:pPr>
+    </w:lvl>
+    <w:lvl w:ilvl="6" w:tentative="1">
+      <w:start w:val="1"/>
+      <w:numFmt w:val="decimal"/>
+      <w:lvlText w:val="%7."/>
+      <w:lvlJc w:val="left"/>
+      <w:pPr>
+        <w:tabs>
+          <w:tab w:val="num" w:pos="5040"/>
+        </w:tabs>
+        <w:ind w:left="5040" w:hanging="360"/>
+      </w:pPr>
+    </w:lvl>
+    <w:lvl w:ilvl="7" w:tentative="1">
+      <w:start w:val="1"/>
+      <w:numFmt w:val="decimal"/>
+      <w:lvlText w:val="%8."/>
+      <w:lvlJc w:val="left"/>
+      <w:pPr>
+        <w:tabs>
+          <w:tab w:val="num" w:pos="5760"/>
+        </w:tabs>
+        <w:ind w:left="5760" w:hanging="360"/>
+      </w:pPr>
+    </w:lvl>
+    <w:lvl w:ilvl="8" w:tentative="1">
+      <w:start w:val="1"/>
+      <w:numFmt w:val="decimal"/>
+      <w:lvlText w:val="%9."/>
+      <w:lvlJc w:val="left"/>
+      <w:pPr>
+        <w:tabs>
+          <w:tab w:val="num" w:pos="6480"/>
+        </w:tabs>
+        <w:ind w:left="6480" w:hanging="360"/>
+      </w:pPr>
+    </w:lvl>
+  </w:abstractNum>
+  <w:abstractNum w:abstractNumId="13" w15:restartNumberingAfterBreak="0">
+    <w:nsid w:val="1DD07001"/>
+    <w:multiLevelType w:val="multilevel"/>
+    <w:tmpl w:val="6B7CF3D4"/>
+    <w:lvl w:ilvl="0">
+      <w:start w:val="1"/>
+      <w:numFmt w:val="bullet"/>
+      <w:lvlText w:val=""/>
+      <w:lvlJc w:val="left"/>
+      <w:pPr>
+        <w:tabs>
+          <w:tab w:val="num" w:pos="720"/>
+        </w:tabs>
+        <w:ind w:left="720" w:hanging="360"/>
+      </w:pPr>
+      <w:rPr>
+        <w:rFonts w:ascii="Symbol" w:hAnsi="Symbol" w:hint="default"/>
+        <w:sz w:val="20"/>
+      </w:rPr>
+    </w:lvl>
+    <w:lvl w:ilvl="1" w:tentative="1">
+      <w:start w:val="1"/>
+      <w:numFmt w:val="bullet"/>
+      <w:lvlText w:val=""/>
+      <w:lvlJc w:val="left"/>
+      <w:pPr>
+        <w:tabs>
+          <w:tab w:val="num" w:pos="1440"/>
+        </w:tabs>
+        <w:ind w:left="1440" w:hanging="360"/>
+      </w:pPr>
+      <w:rPr>
+        <w:rFonts w:ascii="Symbol" w:hAnsi="Symbol" w:hint="default"/>
+        <w:sz w:val="20"/>
+      </w:rPr>
+    </w:lvl>
+    <w:lvl w:ilvl="2" w:tentative="1">
+      <w:start w:val="1"/>
+      <w:numFmt w:val="bullet"/>
+      <w:lvlText w:val=""/>
+      <w:lvlJc w:val="left"/>
+      <w:pPr>
+        <w:tabs>
+          <w:tab w:val="num" w:pos="2160"/>
+        </w:tabs>
+        <w:ind w:left="2160" w:hanging="360"/>
+      </w:pPr>
+      <w:rPr>
+        <w:rFonts w:ascii="Symbol" w:hAnsi="Symbol" w:hint="default"/>
+        <w:sz w:val="20"/>
+      </w:rPr>
+    </w:lvl>
+    <w:lvl w:ilvl="3" w:tentative="1">
+      <w:start w:val="1"/>
+      <w:numFmt w:val="bullet"/>
+      <w:lvlText w:val=""/>
+      <w:lvlJc w:val="left"/>
+      <w:pPr>
+        <w:tabs>
+          <w:tab w:val="num" w:pos="2880"/>
+        </w:tabs>
+        <w:ind w:left="2880" w:hanging="360"/>
+      </w:pPr>
+      <w:rPr>
+        <w:rFonts w:ascii="Symbol" w:hAnsi="Symbol" w:hint="default"/>
+        <w:sz w:val="20"/>
+      </w:rPr>
+    </w:lvl>
+    <w:lvl w:ilvl="4" w:tentative="1">
+      <w:start w:val="1"/>
+      <w:numFmt w:val="bullet"/>
+      <w:lvlText w:val=""/>
+      <w:lvlJc w:val="left"/>
+      <w:pPr>
+        <w:tabs>
+          <w:tab w:val="num" w:pos="3600"/>
+        </w:tabs>
+        <w:ind w:left="3600" w:hanging="360"/>
+      </w:pPr>
+      <w:rPr>
+        <w:rFonts w:ascii="Symbol" w:hAnsi="Symbol" w:hint="default"/>
+        <w:sz w:val="20"/>
+      </w:rPr>
+    </w:lvl>
+    <w:lvl w:ilvl="5" w:tentative="1">
+      <w:start w:val="1"/>
+      <w:numFmt w:val="bullet"/>
+      <w:lvlText w:val=""/>
+      <w:lvlJc w:val="left"/>
+      <w:pPr>
+        <w:tabs>
+          <w:tab w:val="num" w:pos="4320"/>
+        </w:tabs>
+        <w:ind w:left="4320" w:hanging="360"/>
+      </w:pPr>
+      <w:rPr>
+        <w:rFonts w:ascii="Symbol" w:hAnsi="Symbol" w:hint="default"/>
+        <w:sz w:val="20"/>
+      </w:rPr>
+    </w:lvl>
+    <w:lvl w:ilvl="6" w:tentative="1">
+      <w:start w:val="1"/>
+      <w:numFmt w:val="bullet"/>
+      <w:lvlText w:val=""/>
+      <w:lvlJc w:val="left"/>
+      <w:pPr>
+        <w:tabs>
+          <w:tab w:val="num" w:pos="5040"/>
+        </w:tabs>
+        <w:ind w:left="5040" w:hanging="360"/>
+      </w:pPr>
+      <w:rPr>
+        <w:rFonts w:ascii="Symbol" w:hAnsi="Symbol" w:hint="default"/>
+        <w:sz w:val="20"/>
+      </w:rPr>
+    </w:lvl>
+    <w:lvl w:ilvl="7" w:tentative="1">
+      <w:start w:val="1"/>
+      <w:numFmt w:val="bullet"/>
+      <w:lvlText w:val=""/>
+      <w:lvlJc w:val="left"/>
+      <w:pPr>
+        <w:tabs>
+          <w:tab w:val="num" w:pos="5760"/>
+        </w:tabs>
+        <w:ind w:left="5760" w:hanging="360"/>
+      </w:pPr>
+      <w:rPr>
+        <w:rFonts w:ascii="Symbol" w:hAnsi="Symbol" w:hint="default"/>
+        <w:sz w:val="20"/>
+      </w:rPr>
+    </w:lvl>
+    <w:lvl w:ilvl="8" w:tentative="1">
+      <w:start w:val="1"/>
+      <w:numFmt w:val="bullet"/>
+      <w:lvlText w:val=""/>
+      <w:lvlJc w:val="left"/>
+      <w:pPr>
+        <w:tabs>
+          <w:tab w:val="num" w:pos="6480"/>
+        </w:tabs>
+        <w:ind w:left="6480" w:hanging="360"/>
+      </w:pPr>
+      <w:rPr>
+        <w:rFonts w:ascii="Symbol" w:hAnsi="Symbol" w:hint="default"/>
+        <w:sz w:val="20"/>
+      </w:rPr>
+    </w:lvl>
+  </w:abstractNum>
+  <w:abstractNum w:abstractNumId="14" w15:restartNumberingAfterBreak="0">
+    <w:nsid w:val="20244B34"/>
+    <w:multiLevelType w:val="multilevel"/>
+    <w:tmpl w:val="BF34BDFE"/>
+    <w:lvl w:ilvl="0">
+      <w:start w:val="1"/>
+      <w:numFmt w:val="bullet"/>
+      <w:lvlText w:val=""/>
+      <w:lvlJc w:val="left"/>
+      <w:pPr>
+        <w:tabs>
+          <w:tab w:val="num" w:pos="720"/>
+        </w:tabs>
+        <w:ind w:left="720" w:hanging="360"/>
+      </w:pPr>
+      <w:rPr>
+        <w:rFonts w:ascii="Symbol" w:hAnsi="Symbol" w:hint="default"/>
+        <w:sz w:val="20"/>
+      </w:rPr>
+    </w:lvl>
+    <w:lvl w:ilvl="1" w:tentative="1">
+      <w:start w:val="1"/>
+      <w:numFmt w:val="bullet"/>
+      <w:lvlText w:val=""/>
+      <w:lvlJc w:val="left"/>
+      <w:pPr>
+        <w:tabs>
+          <w:tab w:val="num" w:pos="1440"/>
+        </w:tabs>
+        <w:ind w:left="1440" w:hanging="360"/>
+      </w:pPr>
+      <w:rPr>
+        <w:rFonts w:ascii="Symbol" w:hAnsi="Symbol" w:hint="default"/>
+        <w:sz w:val="20"/>
+      </w:rPr>
+    </w:lvl>
+    <w:lvl w:ilvl="2" w:tentative="1">
+      <w:start w:val="1"/>
+      <w:numFmt w:val="bullet"/>
+      <w:lvlText w:val=""/>
+      <w:lvlJc w:val="left"/>
+      <w:pPr>
+        <w:tabs>
+          <w:tab w:val="num" w:pos="2160"/>
+        </w:tabs>
+        <w:ind w:left="2160" w:hanging="360"/>
+      </w:pPr>
+      <w:rPr>
+        <w:rFonts w:ascii="Symbol" w:hAnsi="Symbol" w:hint="default"/>
+        <w:sz w:val="20"/>
+      </w:rPr>
+    </w:lvl>
+    <w:lvl w:ilvl="3" w:tentative="1">
+      <w:start w:val="1"/>
+      <w:numFmt w:val="bullet"/>
+      <w:lvlText w:val=""/>
+      <w:lvlJc w:val="left"/>
+      <w:pPr>
+        <w:tabs>
+          <w:tab w:val="num" w:pos="2880"/>
+        </w:tabs>
+        <w:ind w:left="2880" w:hanging="360"/>
+      </w:pPr>
+      <w:rPr>
+        <w:rFonts w:ascii="Symbol" w:hAnsi="Symbol" w:hint="default"/>
+        <w:sz w:val="20"/>
+      </w:rPr>
+    </w:lvl>
+    <w:lvl w:ilvl="4" w:tentative="1">
+      <w:start w:val="1"/>
+      <w:numFmt w:val="bullet"/>
+      <w:lvlText w:val=""/>
+      <w:lvlJc w:val="left"/>
+      <w:pPr>
+        <w:tabs>
+          <w:tab w:val="num" w:pos="3600"/>
+        </w:tabs>
+        <w:ind w:left="3600" w:hanging="360"/>
+      </w:pPr>
+      <w:rPr>
+        <w:rFonts w:ascii="Symbol" w:hAnsi="Symbol" w:hint="default"/>
+        <w:sz w:val="20"/>
+      </w:rPr>
+    </w:lvl>
+    <w:lvl w:ilvl="5" w:tentative="1">
+      <w:start w:val="1"/>
+      <w:numFmt w:val="bullet"/>
+      <w:lvlText w:val=""/>
+      <w:lvlJc w:val="left"/>
+      <w:pPr>
+        <w:tabs>
+          <w:tab w:val="num" w:pos="4320"/>
+        </w:tabs>
+        <w:ind w:left="4320" w:hanging="360"/>
+      </w:pPr>
+      <w:rPr>
+        <w:rFonts w:ascii="Symbol" w:hAnsi="Symbol" w:hint="default"/>
+        <w:sz w:val="20"/>
+      </w:rPr>
+    </w:lvl>
+    <w:lvl w:ilvl="6" w:tentative="1">
+      <w:start w:val="1"/>
+      <w:numFmt w:val="bullet"/>
+      <w:lvlText w:val=""/>
+      <w:lvlJc w:val="left"/>
+      <w:pPr>
+        <w:tabs>
+          <w:tab w:val="num" w:pos="5040"/>
+        </w:tabs>
+        <w:ind w:left="5040" w:hanging="360"/>
+      </w:pPr>
+      <w:rPr>
+        <w:rFonts w:ascii="Symbol" w:hAnsi="Symbol" w:hint="default"/>
+        <w:sz w:val="20"/>
+      </w:rPr>
+    </w:lvl>
+    <w:lvl w:ilvl="7" w:tentative="1">
+      <w:start w:val="1"/>
+      <w:numFmt w:val="bullet"/>
+      <w:lvlText w:val=""/>
+      <w:lvlJc w:val="left"/>
+      <w:pPr>
+        <w:tabs>
+          <w:tab w:val="num" w:pos="5760"/>
+        </w:tabs>
+        <w:ind w:left="5760" w:hanging="360"/>
+      </w:pPr>
+      <w:rPr>
+        <w:rFonts w:ascii="Symbol" w:hAnsi="Symbol" w:hint="default"/>
+        <w:sz w:val="20"/>
+      </w:rPr>
+    </w:lvl>
+    <w:lvl w:ilvl="8" w:tentative="1">
+      <w:start w:val="1"/>
+      <w:numFmt w:val="bullet"/>
+      <w:lvlText w:val=""/>
+      <w:lvlJc w:val="left"/>
+      <w:pPr>
+        <w:tabs>
+          <w:tab w:val="num" w:pos="6480"/>
+        </w:tabs>
+        <w:ind w:left="6480" w:hanging="360"/>
+      </w:pPr>
+      <w:rPr>
+        <w:rFonts w:ascii="Symbol" w:hAnsi="Symbol" w:hint="default"/>
+        <w:sz w:val="20"/>
+      </w:rPr>
+    </w:lvl>
+  </w:abstractNum>
+  <w:abstractNum w:abstractNumId="15" w15:restartNumberingAfterBreak="0">
     <w:nsid w:val="2CCC4FE3"/>
     <w:multiLevelType w:val="hybridMultilevel"/>
     <w:tmpl w:val="74C408D4"/>
@@ -1260,7 +1828,120 @@
       </w:rPr>
     </w:lvl>
   </w:abstractNum>
-  <w:abstractNum w:abstractNumId="11" w15:restartNumberingAfterBreak="0">
+  <w:abstractNum w:abstractNumId="16" w15:restartNumberingAfterBreak="0">
+    <w:nsid w:val="2D4C0240"/>
+    <w:multiLevelType w:val="multilevel"/>
+    <w:tmpl w:val="0AD03044"/>
+    <w:lvl w:ilvl="0">
+      <w:start w:val="10"/>
+      <w:numFmt w:val="decimal"/>
+      <w:lvlText w:val="%1."/>
+      <w:lvlJc w:val="left"/>
+      <w:pPr>
+        <w:tabs>
+          <w:tab w:val="num" w:pos="720"/>
+        </w:tabs>
+        <w:ind w:left="720" w:hanging="360"/>
+      </w:pPr>
+    </w:lvl>
+    <w:lvl w:ilvl="1" w:tentative="1">
+      <w:start w:val="1"/>
+      <w:numFmt w:val="decimal"/>
+      <w:lvlText w:val="%2."/>
+      <w:lvlJc w:val="left"/>
+      <w:pPr>
+        <w:tabs>
+          <w:tab w:val="num" w:pos="1440"/>
+        </w:tabs>
+        <w:ind w:left="1440" w:hanging="360"/>
+      </w:pPr>
+    </w:lvl>
+    <w:lvl w:ilvl="2" w:tentative="1">
+      <w:start w:val="1"/>
+      <w:numFmt w:val="decimal"/>
+      <w:lvlText w:val="%3."/>
+      <w:lvlJc w:val="left"/>
+      <w:pPr>
+        <w:tabs>
+          <w:tab w:val="num" w:pos="2160"/>
+        </w:tabs>
+        <w:ind w:left="2160" w:hanging="360"/>
+      </w:pPr>
+    </w:lvl>
+    <w:lvl w:ilvl="3" w:tentative="1">
+      <w:start w:val="1"/>
+      <w:numFmt w:val="decimal"/>
+      <w:lvlText w:val="%4."/>
+      <w:lvlJc w:val="left"/>
+      <w:pPr>
+        <w:tabs>
+          <w:tab w:val="num" w:pos="2880"/>
+        </w:tabs>
+        <w:ind w:left="2880" w:hanging="360"/>
+      </w:pPr>
+    </w:lvl>
+    <w:lvl w:ilvl="4" w:tentative="1">
+      <w:start w:val="1"/>
+      <w:numFmt w:val="decimal"/>
+      <w:lvlText w:val="%5."/>
+      <w:lvlJc w:val="left"/>
+      <w:pPr>
+        <w:tabs>
+          <w:tab w:val="num" w:pos="3600"/>
+        </w:tabs>
+        <w:ind w:left="3600" w:hanging="360"/>
+      </w:pPr>
+    </w:lvl>
+    <w:lvl w:ilvl="5" w:tentative="1">
+      <w:start w:val="1"/>
+      <w:numFmt w:val="decimal"/>
+      <w:lvlText w:val="%6."/>
+      <w:lvlJc w:val="left"/>
+      <w:pPr>
+        <w:tabs>
+          <w:tab w:val="num" w:pos="4320"/>
+        </w:tabs>
+        <w:ind w:left="4320" w:hanging="360"/>
+      </w:pPr>
+    </w:lvl>
+    <w:lvl w:ilvl="6" w:tentative="1">
+      <w:start w:val="1"/>
+      <w:numFmt w:val="decimal"/>
+      <w:lvlText w:val="%7."/>
+      <w:lvlJc w:val="left"/>
+      <w:pPr>
+        <w:tabs>
+          <w:tab w:val="num" w:pos="5040"/>
+        </w:tabs>
+        <w:ind w:left="5040" w:hanging="360"/>
+      </w:pPr>
+    </w:lvl>
+    <w:lvl w:ilvl="7" w:tentative="1">
+      <w:start w:val="1"/>
+      <w:numFmt w:val="decimal"/>
+      <w:lvlText w:val="%8."/>
+      <w:lvlJc w:val="left"/>
+      <w:pPr>
+        <w:tabs>
+          <w:tab w:val="num" w:pos="5760"/>
+        </w:tabs>
+        <w:ind w:left="5760" w:hanging="360"/>
+      </w:pPr>
+    </w:lvl>
+    <w:lvl w:ilvl="8" w:tentative="1">
+      <w:start w:val="1"/>
+      <w:numFmt w:val="decimal"/>
+      <w:lvlText w:val="%9."/>
+      <w:lvlJc w:val="left"/>
+      <w:pPr>
+        <w:tabs>
+          <w:tab w:val="num" w:pos="6480"/>
+        </w:tabs>
+        <w:ind w:left="6480" w:hanging="360"/>
+      </w:pPr>
+    </w:lvl>
+  </w:abstractNum>
+  <w:abstractNum w:abstractNumId="17" w15:restartNumberingAfterBreak="0">
     <w:nsid w:val="32A77D1B"/>
     <w:multiLevelType w:val="hybridMultilevel"/>
     <w:tmpl w:val="0C4ADA0C"/>
@@ -1373,7 +2054,269 @@
       </w:rPr>
     </w:lvl>
   </w:abstractNum>
-  <w:abstractNum w:abstractNumId="12" w15:restartNumberingAfterBreak="0">
+  <w:abstractNum w:abstractNumId="18" w15:restartNumberingAfterBreak="0">
+    <w:nsid w:val="3DEB0F73"/>
+    <w:multiLevelType w:val="multilevel"/>
+    <w:tmpl w:val="A4CCB64A"/>
+    <w:lvl w:ilvl="0">
+      <w:start w:val="1"/>
+      <w:numFmt w:val="decimal"/>
+      <w:lvlText w:val="%1."/>
+      <w:lvlJc w:val="left"/>
+      <w:pPr>
+        <w:tabs>
+          <w:tab w:val="num" w:pos="720"/>
+        </w:tabs>
+        <w:ind w:left="720" w:hanging="360"/>
+      </w:pPr>
+    </w:lvl>
+    <w:lvl w:ilvl="1" w:tentative="1">
+      <w:start w:val="1"/>
+      <w:numFmt w:val="decimal"/>
+      <w:lvlText w:val="%2."/>
+      <w:lvlJc w:val="left"/>
+      <w:pPr>
+        <w:tabs>
+          <w:tab w:val="num" w:pos="1440"/>
+        </w:tabs>
+        <w:ind w:left="1440" w:hanging="360"/>
+      </w:pPr>
+    </w:lvl>
+    <w:lvl w:ilvl="2" w:tentative="1">
+      <w:start w:val="1"/>
+      <w:numFmt w:val="decimal"/>
+      <w:lvlText w:val="%3."/>
+      <w:lvlJc w:val="left"/>
+      <w:pPr>
+        <w:tabs>
+          <w:tab w:val="num" w:pos="2160"/>
+        </w:tabs>
+        <w:ind w:left="2160" w:hanging="360"/>
+      </w:pPr>
+    </w:lvl>
+    <w:lvl w:ilvl="3" w:tentative="1">
+      <w:start w:val="1"/>
+      <w:numFmt w:val="decimal"/>
+      <w:lvlText w:val="%4."/>
+      <w:lvlJc w:val="left"/>
+      <w:pPr>
+        <w:tabs>
+          <w:tab w:val="num" w:pos="2880"/>
+        </w:tabs>
+        <w:ind w:left="2880" w:hanging="360"/>
+      </w:pPr>
+    </w:lvl>
+    <w:lvl w:ilvl="4" w:tentative="1">
+      <w:start w:val="1"/>
+      <w:numFmt w:val="decimal"/>
+      <w:lvlText w:val="%5."/>
+      <w:lvlJc w:val="left"/>
+      <w:pPr>
+        <w:tabs>
+          <w:tab w:val="num" w:pos="3600"/>
+        </w:tabs>
+        <w:ind w:left="3600" w:hanging="360"/>
+      </w:pPr>
+    </w:lvl>
+    <w:lvl w:ilvl="5" w:tentative="1">
+      <w:start w:val="1"/>
+      <w:numFmt w:val="decimal"/>
+      <w:lvlText w:val="%6."/>
+      <w:lvlJc w:val="left"/>
+      <w:pPr>
+        <w:tabs>
+          <w:tab w:val="num" w:pos="4320"/>
+        </w:tabs>
+        <w:ind w:left="4320" w:hanging="360"/>
+      </w:pPr>
+    </w:lvl>
+    <w:lvl w:ilvl="6" w:tentative="1">
+      <w:start w:val="1"/>
+      <w:numFmt w:val="decimal"/>
+      <w:lvlText w:val="%7."/>
+      <w:lvlJc w:val="left"/>
+      <w:pPr>
+        <w:tabs>
+          <w:tab w:val="num" w:pos="5040"/>
+        </w:tabs>
+        <w:ind w:left="5040" w:hanging="360"/>
+      </w:pPr>
+    </w:lvl>
+    <w:lvl w:ilvl="7" w:tentative="1">
+      <w:start w:val="1"/>
+      <w:numFmt w:val="decimal"/>
+      <w:lvlText w:val="%8."/>
+      <w:lvlJc w:val="left"/>
+      <w:pPr>
+        <w:tabs>
+          <w:tab w:val="num" w:pos="5760"/>
+        </w:tabs>
+        <w:ind w:left="5760" w:hanging="360"/>
+      </w:pPr>
+    </w:lvl>
+    <w:lvl w:ilvl="8" w:tentative="1">
+      <w:start w:val="1"/>
+      <w:numFmt w:val="decimal"/>
+      <w:lvlText w:val="%9."/>
+      <w:lvlJc w:val="left"/>
+      <w:pPr>
+        <w:tabs>
+          <w:tab w:val="num" w:pos="6480"/>
+        </w:tabs>
+        <w:ind w:left="6480" w:hanging="360"/>
+      </w:pPr>
+    </w:lvl>
+  </w:abstractNum>
+  <w:abstractNum w:abstractNumId="19" w15:restartNumberingAfterBreak="0">
+    <w:nsid w:val="41342168"/>
+    <w:multiLevelType w:val="multilevel"/>
+    <w:tmpl w:val="B33A4C92"/>
+    <w:lvl w:ilvl="0">
+      <w:start w:val="1"/>
+      <w:numFmt w:val="bullet"/>
+      <w:lvlText w:val=""/>
+      <w:lvlJc w:val="left"/>
+      <w:pPr>
+        <w:tabs>
+          <w:tab w:val="num" w:pos="720"/>
+        </w:tabs>
+        <w:ind w:left="720" w:hanging="360"/>
+      </w:pPr>
+      <w:rPr>
+        <w:rFonts w:ascii="Symbol" w:hAnsi="Symbol" w:hint="default"/>
+        <w:sz w:val="20"/>
+      </w:rPr>
+    </w:lvl>
+    <w:lvl w:ilvl="1" w:tentative="1">
+      <w:start w:val="1"/>
+      <w:numFmt w:val="bullet"/>
+      <w:lvlText w:val=""/>
+      <w:lvlJc w:val="left"/>
+      <w:pPr>
+        <w:tabs>
+          <w:tab w:val="num" w:pos="1440"/>
+        </w:tabs>
+        <w:ind w:left="1440" w:hanging="360"/>
+      </w:pPr>
+      <w:rPr>
+        <w:rFonts w:ascii="Symbol" w:hAnsi="Symbol" w:hint="default"/>
+        <w:sz w:val="20"/>
+      </w:rPr>
+    </w:lvl>
+    <w:lvl w:ilvl="2" w:tentative="1">
+      <w:start w:val="1"/>
+      <w:numFmt w:val="bullet"/>
+      <w:lvlText w:val=""/>
+      <w:lvlJc w:val="left"/>
+      <w:pPr>
+        <w:tabs>
+          <w:tab w:val="num" w:pos="2160"/>
+        </w:tabs>
+        <w:ind w:left="2160" w:hanging="360"/>
+      </w:pPr>
+      <w:rPr>
+        <w:rFonts w:ascii="Symbol" w:hAnsi="Symbol" w:hint="default"/>
+        <w:sz w:val="20"/>
+      </w:rPr>
+    </w:lvl>
+    <w:lvl w:ilvl="3" w:tentative="1">
+      <w:start w:val="1"/>
+      <w:numFmt w:val="bullet"/>
+      <w:lvlText w:val=""/>
+      <w:lvlJc w:val="left"/>
+      <w:pPr>
+        <w:tabs>
+          <w:tab w:val="num" w:pos="2880"/>
+        </w:tabs>
+        <w:ind w:left="2880" w:hanging="360"/>
+      </w:pPr>
+      <w:rPr>
+        <w:rFonts w:ascii="Symbol" w:hAnsi="Symbol" w:hint="default"/>
+        <w:sz w:val="20"/>
+      </w:rPr>
+    </w:lvl>
+    <w:lvl w:ilvl="4" w:tentative="1">
+      <w:start w:val="1"/>
+      <w:numFmt w:val="bullet"/>
+      <w:lvlText w:val=""/>
+      <w:lvlJc w:val="left"/>
+      <w:pPr>
+        <w:tabs>
+          <w:tab w:val="num" w:pos="3600"/>
+        </w:tabs>
+        <w:ind w:left="3600" w:hanging="360"/>
+      </w:pPr>
+      <w:rPr>
+        <w:rFonts w:ascii="Symbol" w:hAnsi="Symbol" w:hint="default"/>
+        <w:sz w:val="20"/>
+      </w:rPr>
+    </w:lvl>
+    <w:lvl w:ilvl="5" w:tentative="1">
+      <w:start w:val="1"/>
+      <w:numFmt w:val="bullet"/>
+      <w:lvlText w:val=""/>
+      <w:lvlJc w:val="left"/>
+      <w:pPr>
+        <w:tabs>
+          <w:tab w:val="num" w:pos="4320"/>
+        </w:tabs>
+        <w:ind w:left="4320" w:hanging="360"/>
+      </w:pPr>
+      <w:rPr>
+        <w:rFonts w:ascii="Symbol" w:hAnsi="Symbol" w:hint="default"/>
+        <w:sz w:val="20"/>
+      </w:rPr>
+    </w:lvl>
+    <w:lvl w:ilvl="6" w:tentative="1">
+      <w:start w:val="1"/>
+      <w:numFmt w:val="bullet"/>
+      <w:lvlText w:val=""/>
+      <w:lvlJc w:val="left"/>
+      <w:pPr>
+        <w:tabs>
+          <w:tab w:val="num" w:pos="5040"/>
+        </w:tabs>
+        <w:ind w:left="5040" w:hanging="360"/>
+      </w:pPr>
+      <w:rPr>
+        <w:rFonts w:ascii="Symbol" w:hAnsi="Symbol" w:hint="default"/>
+        <w:sz w:val="20"/>
+      </w:rPr>
+    </w:lvl>
+    <w:lvl w:ilvl="7" w:tentative="1">
+      <w:start w:val="1"/>
+      <w:numFmt w:val="bullet"/>
+      <w:lvlText w:val=""/>
+      <w:lvlJc w:val="left"/>
+      <w:pPr>
+        <w:tabs>
+          <w:tab w:val="num" w:pos="5760"/>
+        </w:tabs>
+        <w:ind w:left="5760" w:hanging="360"/>
+      </w:pPr>
+      <w:rPr>
+        <w:rFonts w:ascii="Symbol" w:hAnsi="Symbol" w:hint="default"/>
+        <w:sz w:val="20"/>
+      </w:rPr>
+    </w:lvl>
+    <w:lvl w:ilvl="8" w:tentative="1">
+      <w:start w:val="1"/>
+      <w:numFmt w:val="bullet"/>
+      <w:lvlText w:val=""/>
+      <w:lvlJc w:val="left"/>
+      <w:pPr>
+        <w:tabs>
+          <w:tab w:val="num" w:pos="6480"/>
+        </w:tabs>
+        <w:ind w:left="6480" w:hanging="360"/>
+      </w:pPr>
+      <w:rPr>
+        <w:rFonts w:ascii="Symbol" w:hAnsi="Symbol" w:hint="default"/>
+        <w:sz w:val="20"/>
+      </w:rPr>
+    </w:lvl>
+  </w:abstractNum>
+  <w:abstractNum w:abstractNumId="20" w15:restartNumberingAfterBreak="0">
     <w:nsid w:val="4B3C0C19"/>
     <w:multiLevelType w:val="multilevel"/>
     <w:tmpl w:val="79342806"/>
@@ -1400,6 +2343,417 @@
       <w:rPr>
         <w:rFonts w:ascii="Cambria" w:eastAsia="맑은 고딕" w:hAnsi="Cambria" w:cstheme="minorBidi" w:hint="default"/>
       </w:rPr>
+    </w:lvl>
+    <w:lvl w:ilvl="2" w:tentative="1">
+      <w:start w:val="1"/>
+      <w:numFmt w:val="decimal"/>
+      <w:lvlText w:val="%3."/>
+      <w:lvlJc w:val="left"/>
+      <w:pPr>
+        <w:tabs>
+          <w:tab w:val="num" w:pos="2160"/>
+        </w:tabs>
+        <w:ind w:left="2160" w:hanging="360"/>
+      </w:pPr>
+    </w:lvl>
+    <w:lvl w:ilvl="3" w:tentative="1">
+      <w:start w:val="1"/>
+      <w:numFmt w:val="decimal"/>
+      <w:lvlText w:val="%4."/>
+      <w:lvlJc w:val="left"/>
+      <w:pPr>
+        <w:tabs>
+          <w:tab w:val="num" w:pos="2880"/>
+        </w:tabs>
+        <w:ind w:left="2880" w:hanging="360"/>
+      </w:pPr>
+    </w:lvl>
+    <w:lvl w:ilvl="4" w:tentative="1">
+      <w:start w:val="1"/>
+      <w:numFmt w:val="decimal"/>
+      <w:lvlText w:val="%5."/>
+      <w:lvlJc w:val="left"/>
+      <w:pPr>
+        <w:tabs>
+          <w:tab w:val="num" w:pos="3600"/>
+        </w:tabs>
+        <w:ind w:left="3600" w:hanging="360"/>
+      </w:pPr>
+    </w:lvl>
+    <w:lvl w:ilvl="5" w:tentative="1">
+      <w:start w:val="1"/>
+      <w:numFmt w:val="decimal"/>
+      <w:lvlText w:val="%6."/>
+      <w:lvlJc w:val="left"/>
+      <w:pPr>
+        <w:tabs>
+          <w:tab w:val="num" w:pos="4320"/>
+        </w:tabs>
+        <w:ind w:left="4320" w:hanging="360"/>
+      </w:pPr>
+    </w:lvl>
+    <w:lvl w:ilvl="6" w:tentative="1">
+      <w:start w:val="1"/>
+      <w:numFmt w:val="decimal"/>
+      <w:lvlText w:val="%7."/>
+      <w:lvlJc w:val="left"/>
+      <w:pPr>
+        <w:tabs>
+          <w:tab w:val="num" w:pos="5040"/>
+        </w:tabs>
+        <w:ind w:left="5040" w:hanging="360"/>
+      </w:pPr>
+    </w:lvl>
+    <w:lvl w:ilvl="7" w:tentative="1">
+      <w:start w:val="1"/>
+      <w:numFmt w:val="decimal"/>
+      <w:lvlText w:val="%8."/>
+      <w:lvlJc w:val="left"/>
+      <w:pPr>
+        <w:tabs>
+          <w:tab w:val="num" w:pos="5760"/>
+        </w:tabs>
+        <w:ind w:left="5760" w:hanging="360"/>
+      </w:pPr>
+    </w:lvl>
+    <w:lvl w:ilvl="8" w:tentative="1">
+      <w:start w:val="1"/>
+      <w:numFmt w:val="decimal"/>
+      <w:lvlText w:val="%9."/>
+      <w:lvlJc w:val="left"/>
+      <w:pPr>
+        <w:tabs>
+          <w:tab w:val="num" w:pos="6480"/>
+        </w:tabs>
+        <w:ind w:left="6480" w:hanging="360"/>
+      </w:pPr>
+    </w:lvl>
+  </w:abstractNum>
+  <w:abstractNum w:abstractNumId="21" w15:restartNumberingAfterBreak="0">
+    <w:nsid w:val="4D1C02E2"/>
+    <w:multiLevelType w:val="multilevel"/>
+    <w:tmpl w:val="84A89FEA"/>
+    <w:lvl w:ilvl="0">
+      <w:start w:val="1"/>
+      <w:numFmt w:val="bullet"/>
+      <w:lvlText w:val=""/>
+      <w:lvlJc w:val="left"/>
+      <w:pPr>
+        <w:tabs>
+          <w:tab w:val="num" w:pos="720"/>
+        </w:tabs>
+        <w:ind w:left="720" w:hanging="360"/>
+      </w:pPr>
+      <w:rPr>
+        <w:rFonts w:ascii="Symbol" w:hAnsi="Symbol" w:hint="default"/>
+        <w:sz w:val="20"/>
+      </w:rPr>
+    </w:lvl>
+    <w:lvl w:ilvl="1" w:tentative="1">
+      <w:start w:val="1"/>
+      <w:numFmt w:val="bullet"/>
+      <w:lvlText w:val=""/>
+      <w:lvlJc w:val="left"/>
+      <w:pPr>
+        <w:tabs>
+          <w:tab w:val="num" w:pos="1440"/>
+        </w:tabs>
+        <w:ind w:left="1440" w:hanging="360"/>
+      </w:pPr>
+      <w:rPr>
+        <w:rFonts w:ascii="Symbol" w:hAnsi="Symbol" w:hint="default"/>
+        <w:sz w:val="20"/>
+      </w:rPr>
+    </w:lvl>
+    <w:lvl w:ilvl="2" w:tentative="1">
+      <w:start w:val="1"/>
+      <w:numFmt w:val="bullet"/>
+      <w:lvlText w:val=""/>
+      <w:lvlJc w:val="left"/>
+      <w:pPr>
+        <w:tabs>
+          <w:tab w:val="num" w:pos="2160"/>
+        </w:tabs>
+        <w:ind w:left="2160" w:hanging="360"/>
+      </w:pPr>
+      <w:rPr>
+        <w:rFonts w:ascii="Symbol" w:hAnsi="Symbol" w:hint="default"/>
+        <w:sz w:val="20"/>
+      </w:rPr>
+    </w:lvl>
+    <w:lvl w:ilvl="3" w:tentative="1">
+      <w:start w:val="1"/>
+      <w:numFmt w:val="bullet"/>
+      <w:lvlText w:val=""/>
+      <w:lvlJc w:val="left"/>
+      <w:pPr>
+        <w:tabs>
+          <w:tab w:val="num" w:pos="2880"/>
+        </w:tabs>
+        <w:ind w:left="2880" w:hanging="360"/>
+      </w:pPr>
+      <w:rPr>
+        <w:rFonts w:ascii="Symbol" w:hAnsi="Symbol" w:hint="default"/>
+        <w:sz w:val="20"/>
+      </w:rPr>
+    </w:lvl>
+    <w:lvl w:ilvl="4" w:tentative="1">
+      <w:start w:val="1"/>
+      <w:numFmt w:val="bullet"/>
+      <w:lvlText w:val=""/>
+      <w:lvlJc w:val="left"/>
+      <w:pPr>
+        <w:tabs>
+          <w:tab w:val="num" w:pos="3600"/>
+        </w:tabs>
+        <w:ind w:left="3600" w:hanging="360"/>
+      </w:pPr>
+      <w:rPr>
+        <w:rFonts w:ascii="Symbol" w:hAnsi="Symbol" w:hint="default"/>
+        <w:sz w:val="20"/>
+      </w:rPr>
+    </w:lvl>
+    <w:lvl w:ilvl="5" w:tentative="1">
+      <w:start w:val="1"/>
+      <w:numFmt w:val="bullet"/>
+      <w:lvlText w:val=""/>
+      <w:lvlJc w:val="left"/>
+      <w:pPr>
+        <w:tabs>
+          <w:tab w:val="num" w:pos="4320"/>
+        </w:tabs>
+        <w:ind w:left="4320" w:hanging="360"/>
+      </w:pPr>
+      <w:rPr>
+        <w:rFonts w:ascii="Symbol" w:hAnsi="Symbol" w:hint="default"/>
+        <w:sz w:val="20"/>
+      </w:rPr>
+    </w:lvl>
+    <w:lvl w:ilvl="6" w:tentative="1">
+      <w:start w:val="1"/>
+      <w:numFmt w:val="bullet"/>
+      <w:lvlText w:val=""/>
+      <w:lvlJc w:val="left"/>
+      <w:pPr>
+        <w:tabs>
+          <w:tab w:val="num" w:pos="5040"/>
+        </w:tabs>
+        <w:ind w:left="5040" w:hanging="360"/>
+      </w:pPr>
+      <w:rPr>
+        <w:rFonts w:ascii="Symbol" w:hAnsi="Symbol" w:hint="default"/>
+        <w:sz w:val="20"/>
+      </w:rPr>
+    </w:lvl>
+    <w:lvl w:ilvl="7" w:tentative="1">
+      <w:start w:val="1"/>
+      <w:numFmt w:val="bullet"/>
+      <w:lvlText w:val=""/>
+      <w:lvlJc w:val="left"/>
+      <w:pPr>
+        <w:tabs>
+          <w:tab w:val="num" w:pos="5760"/>
+        </w:tabs>
+        <w:ind w:left="5760" w:hanging="360"/>
+      </w:pPr>
+      <w:rPr>
+        <w:rFonts w:ascii="Symbol" w:hAnsi="Symbol" w:hint="default"/>
+        <w:sz w:val="20"/>
+      </w:rPr>
+    </w:lvl>
+    <w:lvl w:ilvl="8" w:tentative="1">
+      <w:start w:val="1"/>
+      <w:numFmt w:val="bullet"/>
+      <w:lvlText w:val=""/>
+      <w:lvlJc w:val="left"/>
+      <w:pPr>
+        <w:tabs>
+          <w:tab w:val="num" w:pos="6480"/>
+        </w:tabs>
+        <w:ind w:left="6480" w:hanging="360"/>
+      </w:pPr>
+      <w:rPr>
+        <w:rFonts w:ascii="Symbol" w:hAnsi="Symbol" w:hint="default"/>
+        <w:sz w:val="20"/>
+      </w:rPr>
+    </w:lvl>
+  </w:abstractNum>
+  <w:abstractNum w:abstractNumId="22" w15:restartNumberingAfterBreak="0">
+    <w:nsid w:val="523D2D23"/>
+    <w:multiLevelType w:val="multilevel"/>
+    <w:tmpl w:val="9050B6AC"/>
+    <w:lvl w:ilvl="0">
+      <w:start w:val="1"/>
+      <w:numFmt w:val="bullet"/>
+      <w:lvlText w:val=""/>
+      <w:lvlJc w:val="left"/>
+      <w:pPr>
+        <w:tabs>
+          <w:tab w:val="num" w:pos="720"/>
+        </w:tabs>
+        <w:ind w:left="720" w:hanging="360"/>
+      </w:pPr>
+      <w:rPr>
+        <w:rFonts w:ascii="Symbol" w:hAnsi="Symbol" w:hint="default"/>
+        <w:sz w:val="20"/>
+      </w:rPr>
+    </w:lvl>
+    <w:lvl w:ilvl="1" w:tentative="1">
+      <w:start w:val="1"/>
+      <w:numFmt w:val="bullet"/>
+      <w:lvlText w:val=""/>
+      <w:lvlJc w:val="left"/>
+      <w:pPr>
+        <w:tabs>
+          <w:tab w:val="num" w:pos="1440"/>
+        </w:tabs>
+        <w:ind w:left="1440" w:hanging="360"/>
+      </w:pPr>
+      <w:rPr>
+        <w:rFonts w:ascii="Symbol" w:hAnsi="Symbol" w:hint="default"/>
+        <w:sz w:val="20"/>
+      </w:rPr>
+    </w:lvl>
+    <w:lvl w:ilvl="2" w:tentative="1">
+      <w:start w:val="1"/>
+      <w:numFmt w:val="bullet"/>
+      <w:lvlText w:val=""/>
+      <w:lvlJc w:val="left"/>
+      <w:pPr>
+        <w:tabs>
+          <w:tab w:val="num" w:pos="2160"/>
+        </w:tabs>
+        <w:ind w:left="2160" w:hanging="360"/>
+      </w:pPr>
+      <w:rPr>
+        <w:rFonts w:ascii="Symbol" w:hAnsi="Symbol" w:hint="default"/>
+        <w:sz w:val="20"/>
+      </w:rPr>
+    </w:lvl>
+    <w:lvl w:ilvl="3" w:tentative="1">
+      <w:start w:val="1"/>
+      <w:numFmt w:val="bullet"/>
+      <w:lvlText w:val=""/>
+      <w:lvlJc w:val="left"/>
+      <w:pPr>
+        <w:tabs>
+          <w:tab w:val="num" w:pos="2880"/>
+        </w:tabs>
+        <w:ind w:left="2880" w:hanging="360"/>
+      </w:pPr>
+      <w:rPr>
+        <w:rFonts w:ascii="Symbol" w:hAnsi="Symbol" w:hint="default"/>
+        <w:sz w:val="20"/>
+      </w:rPr>
+    </w:lvl>
+    <w:lvl w:ilvl="4" w:tentative="1">
+      <w:start w:val="1"/>
+      <w:numFmt w:val="bullet"/>
+      <w:lvlText w:val=""/>
+      <w:lvlJc w:val="left"/>
+      <w:pPr>
+        <w:tabs>
+          <w:tab w:val="num" w:pos="3600"/>
+        </w:tabs>
+        <w:ind w:left="3600" w:hanging="360"/>
+      </w:pPr>
+      <w:rPr>
+        <w:rFonts w:ascii="Symbol" w:hAnsi="Symbol" w:hint="default"/>
+        <w:sz w:val="20"/>
+      </w:rPr>
+    </w:lvl>
+    <w:lvl w:ilvl="5" w:tentative="1">
+      <w:start w:val="1"/>
+      <w:numFmt w:val="bullet"/>
+      <w:lvlText w:val=""/>
+      <w:lvlJc w:val="left"/>
+      <w:pPr>
+        <w:tabs>
+          <w:tab w:val="num" w:pos="4320"/>
+        </w:tabs>
+        <w:ind w:left="4320" w:hanging="360"/>
+      </w:pPr>
+      <w:rPr>
+        <w:rFonts w:ascii="Symbol" w:hAnsi="Symbol" w:hint="default"/>
+        <w:sz w:val="20"/>
+      </w:rPr>
+    </w:lvl>
+    <w:lvl w:ilvl="6" w:tentative="1">
+      <w:start w:val="1"/>
+      <w:numFmt w:val="bullet"/>
+      <w:lvlText w:val=""/>
+      <w:lvlJc w:val="left"/>
+      <w:pPr>
+        <w:tabs>
+          <w:tab w:val="num" w:pos="5040"/>
+        </w:tabs>
+        <w:ind w:left="5040" w:hanging="360"/>
+      </w:pPr>
+      <w:rPr>
+        <w:rFonts w:ascii="Symbol" w:hAnsi="Symbol" w:hint="default"/>
+        <w:sz w:val="20"/>
+      </w:rPr>
+    </w:lvl>
+    <w:lvl w:ilvl="7" w:tentative="1">
+      <w:start w:val="1"/>
+      <w:numFmt w:val="bullet"/>
+      <w:lvlText w:val=""/>
+      <w:lvlJc w:val="left"/>
+      <w:pPr>
+        <w:tabs>
+          <w:tab w:val="num" w:pos="5760"/>
+        </w:tabs>
+        <w:ind w:left="5760" w:hanging="360"/>
+      </w:pPr>
+      <w:rPr>
+        <w:rFonts w:ascii="Symbol" w:hAnsi="Symbol" w:hint="default"/>
+        <w:sz w:val="20"/>
+      </w:rPr>
+    </w:lvl>
+    <w:lvl w:ilvl="8" w:tentative="1">
+      <w:start w:val="1"/>
+      <w:numFmt w:val="bullet"/>
+      <w:lvlText w:val=""/>
+      <w:lvlJc w:val="left"/>
+      <w:pPr>
+        <w:tabs>
+          <w:tab w:val="num" w:pos="6480"/>
+        </w:tabs>
+        <w:ind w:left="6480" w:hanging="360"/>
+      </w:pPr>
+      <w:rPr>
+        <w:rFonts w:ascii="Symbol" w:hAnsi="Symbol" w:hint="default"/>
+        <w:sz w:val="20"/>
+      </w:rPr>
+    </w:lvl>
+  </w:abstractNum>
+  <w:abstractNum w:abstractNumId="23" w15:restartNumberingAfterBreak="0">
+    <w:nsid w:val="6BE45344"/>
+    <w:multiLevelType w:val="multilevel"/>
+    <w:tmpl w:val="5462B0A0"/>
+    <w:lvl w:ilvl="0">
+      <w:start w:val="1"/>
+      <w:numFmt w:val="decimal"/>
+      <w:lvlText w:val="%1."/>
+      <w:lvlJc w:val="left"/>
+      <w:pPr>
+        <w:tabs>
+          <w:tab w:val="num" w:pos="720"/>
+        </w:tabs>
+        <w:ind w:left="720" w:hanging="360"/>
+      </w:pPr>
+    </w:lvl>
+    <w:lvl w:ilvl="1" w:tentative="1">
+      <w:start w:val="1"/>
+      <w:numFmt w:val="decimal"/>
+      <w:lvlText w:val="%2."/>
+      <w:lvlJc w:val="left"/>
+      <w:pPr>
+        <w:tabs>
+          <w:tab w:val="num" w:pos="1440"/>
+        </w:tabs>
+        <w:ind w:left="1440" w:hanging="360"/>
+      </w:pPr>
     </w:lvl>
     <w:lvl w:ilvl="2" w:tentative="1">
       <w:start w:val="1"/>
@@ -1514,16 +2868,49 @@
     <w:abstractNumId w:val="0"/>
   </w:num>
   <w:num w:numId="10" w16cid:durableId="2042516123">
-    <w:abstractNumId w:val="11"/>
+    <w:abstractNumId w:val="17"/>
   </w:num>
   <w:num w:numId="11" w16cid:durableId="931620582">
-    <w:abstractNumId w:val="10"/>
+    <w:abstractNumId w:val="15"/>
   </w:num>
   <w:num w:numId="12" w16cid:durableId="1825924828">
-    <w:abstractNumId w:val="12"/>
+    <w:abstractNumId w:val="20"/>
   </w:num>
   <w:num w:numId="13" w16cid:durableId="736322793">
     <w:abstractNumId w:val="9"/>
+  </w:num>
+  <w:num w:numId="14" w16cid:durableId="193421437">
+    <w:abstractNumId w:val="12"/>
+  </w:num>
+  <w:num w:numId="15" w16cid:durableId="1037316887">
+    <w:abstractNumId w:val="23"/>
+  </w:num>
+  <w:num w:numId="16" w16cid:durableId="2051301126">
+    <w:abstractNumId w:val="16"/>
+  </w:num>
+  <w:num w:numId="17" w16cid:durableId="798306033">
+    <w:abstractNumId w:val="21"/>
+  </w:num>
+  <w:num w:numId="18" w16cid:durableId="949121023">
+    <w:abstractNumId w:val="14"/>
+  </w:num>
+  <w:num w:numId="19" w16cid:durableId="1420523004">
+    <w:abstractNumId w:val="13"/>
+  </w:num>
+  <w:num w:numId="20" w16cid:durableId="1152596883">
+    <w:abstractNumId w:val="10"/>
+  </w:num>
+  <w:num w:numId="21" w16cid:durableId="1542742592">
+    <w:abstractNumId w:val="18"/>
+  </w:num>
+  <w:num w:numId="22" w16cid:durableId="181436035">
+    <w:abstractNumId w:val="19"/>
+  </w:num>
+  <w:num w:numId="23" w16cid:durableId="572617363">
+    <w:abstractNumId w:val="11"/>
+  </w:num>
+  <w:num w:numId="24" w16cid:durableId="1206796283">
+    <w:abstractNumId w:val="22"/>
   </w:num>
 </w:numbering>
 </file>

</xml_diff>